<commit_message>
Add congestion-aware rerouting and thesis updates
</commit_message>
<xml_diff>
--- a/paper/面向PCB金手指的测试尾板布点布线设计_完成稿.docx
+++ b/paper/面向PCB金手指的测试尾板布点布线设计_完成稿.docx
@@ -390,7 +390,7 @@
           <w:sz w:val="24"/>
           <w:rFonts w:eastAsia="宋体" w:ascii="Times New Roman" w:hAnsi="Times New Roman"/>
         </w:rPr>
-        <w:t>PCB金手指是板卡与外部设备之间完成电气连接和高速信号传输的重要接口，其端子密度高、边缘空间受限、信号类型复杂，给生产测试阶段的可接触性、覆盖率和测试效率带来了较高要求。传统测试尾板设计主要依赖工程师根据经验进行测试点布设和金手指到测试点的走线规划，在小批量或简单板卡中能够满足需求，但面对高密度金手指、面积受限尾板以及多约束设计规则时，容易出现布点分布不均、局部拥挤、走线绕行较长和设计迭代周期过长等问题。为提高测试尾板设计的自动化水平，本文围绕PCB金手指测试尾板的布点布线问题开展研究，建立了包含几何约束、工艺约束和布线约束的模型，并设计了一种规则网格候选生成、K-means初始分组、禁忌搜索局部优化和A*网格布线相结合的协同优化方法。</w:t>
+        <w:t>PCB金手指是板卡与外部设备之间完成电气连接和高速信号传输的重要接口，其端子密度高、边缘空间受限、信号类型复杂，给生产测试阶段的可接触性、覆盖率和测试效率带来了较高要求。传统测试尾板设计主要依赖工程师根据经验进行测试点布设和金手指到测试点的走线规划，在小批量或简单板卡中能够满足需求，但面对高密度金手指、面积受限尾板以及多约束设计规则时，容易出现布点分布不均、局部拥挤、走线绕行较长和设计迭代周期过长等问题。为提高测试尾板设计的自动化水平，本文围绕PCB金手指测试尾板的布点布线问题开展研究，参考网络流建模、蚁群信息素、领域模型和Transformer-A*联合布线等研究思路，建立了包含几何约束、工艺约束、布线约束和拥塞约束的模型。</w:t>
       </w:r>
     </w:p>
     <w:p>
@@ -404,7 +404,7 @@
           <w:sz w:val="24"/>
           <w:rFonts w:eastAsia="宋体" w:ascii="Times New Roman" w:hAnsi="Times New Roman"/>
         </w:rPr>
-        <w:t>本文首先分析金手指测试尾板的结构特点和测试需求，明确测试点直径、点间距、尾板面积、障碍避让、线宽线距等关键约束；随后将布点任务建模为带间距和障碍约束的候选点选择问题，将布线任务建模为网格图上的路径搜索与合法性检查问题。在算法实现方面，基于C++17开发了命令行原型系统，支持读取案例参数CSV，输出测试点坐标、布线路径、实验指标和SVG可视化结果。针对低密度40 pin、中密度80 pin、高密度120 pin、含障碍区域96 pin和面积受限100 pin五类案例进行仿真实验。实验结果表明，PSO-Hanan优化方案在五组案例中均实现100%测试覆盖率和100%布通率，平均尾板面积占比由基线方案的59.19%降低至14.57%，平均总线长由2014.40 mm降低至796.60 mm，说明该方法能够在保证布通和合法性的前提下有效压缩测试尾板占用面积并改善走线效率。</w:t>
+        <w:t>本文首先分析金手指测试尾板的结构特点和测试需求，明确测试点直径、点间距、尾板面积、障碍避让、线宽线距等关键约束；随后将布点任务建模为带间距和障碍约束的候选点选择问题，将布线任务建模为网格图上的路径搜索、拥塞记录与合法性检查问题。在算法实现方面，基于C++17开发了命令行原型系统，形成规则基线、K-means禁忌搜索、PSO-Hanan布点和拥塞感知重布线四组可复现实验流程。针对低密度40 pin、中密度80 pin、高密度120 pin、含障碍区域96 pin和面积受限100 pin五类案例进行仿真实验。实验结果表明，最终拥塞感知方案在五组案例中均实现100%测试覆盖率和100%布通率，平均尾板面积占比由基线方案的59.19%降低至14.57%，平均总线长由2014.40 mm降低至838.60 mm；相比PSO-Hanan方案，拥塞重布线在部分案例中以少量线长增加换取拥塞峰值或拥挤网格下降，体现了布线质量中的线长-拥塞折中。</w:t>
       </w:r>
     </w:p>
     <w:p>
@@ -417,7 +417,7 @@
           <w:sz w:val="24"/>
           <w:rFonts w:eastAsia="宋体" w:ascii="Times New Roman" w:hAnsi="Times New Roman"/>
         </w:rPr>
-        <w:t>关键词：PCB金手指；测试尾板；测试点插入；自动布线；禁忌搜索；A*算法</w:t>
+        <w:t>关键词：PCB金手指；测试尾板；测试点插入；自动布线；拥塞感知；拆线重布；A*算法</w:t>
       </w:r>
     </w:p>
     <w:p>
@@ -446,7 +446,7 @@
           <w:sz w:val="24"/>
           <w:rFonts w:eastAsia="宋体" w:ascii="Times New Roman" w:hAnsi="Times New Roman"/>
         </w:rPr>
-        <w:t>Gold fingers on printed circuit boards provide critical edge contacts for board-level interconnection and high-speed signal transmission. Their high density, limited edge space and mixed signal requirements make test accessibility and tail-board routing difficult when the design is completed manually. This thesis studies automated test-point placement and routing for PCB gold-finger test tail boards. A constraint model covering geometry, manufacturing rules, obstacle avoidance and routing legality is established. A cooperative algorithm is proposed, combining grid-based candidate generation, K-means-like initial grouping, tabu-search local refinement, PSO-Hanan parameter search and A* grid routing. A C++17 command-line prototype is implemented to read case files, generate placement and routing results, export metrics and produce SVG visualization. Simulated case studies show that the optimized method achieves full coverage and full routability in five representative scenarios while reducing board area occupation and total wire length compared with a rule-based baseline.</w:t>
+        <w:t>Gold fingers on printed circuit boards provide critical edge contacts for board-level interconnection and high-speed signal transmission. Their high density, limited edge space and mixed signal requirements make test accessibility and tail-board routing difficult when the design is completed manually. This thesis studies automated test-point placement and routing for PCB gold-finger test tail boards. Inspired by network-flow modeling, ant-colony pheromone concepts, domain-model routing and Transformer-A* hybrid routing, a constraint model covering geometry, manufacturing rules, obstacle avoidance, congestion and routing legality is established. A C++17 command-line prototype is implemented with four reproducible flows: rule-based baseline, K-means tabu placement, PSO-Hanan placement and congestion-aware rerouting. Simulated case studies show that the final method achieves full coverage and full routability in five representative scenarios while reducing board area occupation and total wire length compared with a rule-based baseline.</w:t>
       </w:r>
     </w:p>
     <w:p>
@@ -459,7 +459,7 @@
           <w:sz w:val="24"/>
           <w:rFonts w:eastAsia="宋体" w:ascii="Times New Roman" w:hAnsi="Times New Roman"/>
         </w:rPr>
-        <w:t>Key words: PCB gold finger; test tail board; test point insertion; automatic routing; tabu search; A* algorithm</w:t>
+        <w:t>Key words: PCB gold finger; test tail board; test point insertion; automatic routing; congestion-aware routing; rip-up and reroute; A* algorithm</w:t>
       </w:r>
     </w:p>
     <w:p/>
@@ -592,7 +592,7 @@
           <w:sz w:val="24"/>
           <w:rFonts w:eastAsia="宋体" w:ascii="Times New Roman" w:hAnsi="Times New Roman"/>
         </w:rPr>
-        <w:t>在EDA工具生态方面，国外商业工具已经具备较成熟的自动布局布线能力，但算法细节通常封闭，且通用自动布线器未必适合测试尾板这类细分结构。国内相关研究更多集中于通用PCB自动布线器、基于蚁群算法或元胞自动机的路径搜索、以及深度学习辅助布局布线。李晓欣针对PCB自动布局布线器的设计实现进行了工程化研究，给出了数据结构、热布局和绕障布线思路；胡木森研究了基于网络流的高性能PCB自动布线方法；白胜泷探索了Transformer在PCB自动布线中的应用。这些工作说明智能优化方法正在进入EDA流程，但面向金手指测试尾板的布点布线协同模型仍有进一步研究空间。</w:t>
+        <w:t>在EDA工具生态方面，国外商业工具已经具备较成熟的自动布局布线能力，但算法细节通常封闭，且通用自动布线器未必适合测试尾板这类细分结构。国内相关研究更多集中于通用PCB自动布线器、基于蚁群算法或元胞自动机的路径搜索、以及深度学习辅助布局布线。李晓欣针对PCB自动布局布线器的设计实现进行了工程化研究，给出了惯性权重粒子群、混合优化和绕障布线思路；胡木森提出基于网络流建模的高性能自动布线方法，强调通过空间划分、流分配和拥塞预布线减少无效搜索；刘自铭在多层PCB布线中引入蚁群信息素、拥挤区域和拆线重布机制，关注过孔、拐点和布通率的综合优化；郑杰与白胜泷分别从领域模型和Transformer-A*联合布线角度探索学习人工布线范式。这些工作说明智能优化方法正在进入EDA流程，但面向金手指测试尾板的布点布线协同模型仍有进一步研究空间。</w:t>
       </w:r>
     </w:p>
     <w:p>
@@ -1503,6 +1503,50 @@
         <w:t>布点和布线不是两个完全独立的阶段。测试点离金手指过近会降低面积占比，但可能导致局部线束拥挤；测试点分散可以提高布线空间，却会增大尾板面积和总线长。本文采用代价反馈思路，将端子距离、测试点纵向位置、点间距和布线路径长度共同作为优化依据。实现中先完成布点并布线评估，再通过局部搜索降低代价。虽然原型没有实现复杂的全局重布线，但整体流程保留了协同优化接口，后续可加入网络流、线性规划或强化学习策略替换局部搜索模块。</w:t>
       </w:r>
     </w:p>
+    <w:p>
+      <w:pPr>
+        <w:pStyle w:val="Heading2"/>
+        <w:spacing w:before="160" w:after="120"/>
+        <w:jc w:val="left"/>
+      </w:pPr>
+      <w:r>
+        <w:rPr>
+          <w:b/>
+          <w:color w:val="1F4E79"/>
+          <w:sz w:val="28"/>
+          <w:rFonts w:eastAsia="黑体" w:ascii="Arial" w:hAnsi="Arial"/>
+        </w:rPr>
+        <w:t>4.3 拥塞感知与拆线重布策略</w:t>
+      </w:r>
+    </w:p>
+    <w:p>
+      <w:pPr>
+        <w:spacing w:line="324" w:lineRule="auto" w:after="120"/>
+        <w:ind w:firstLine="420"/>
+      </w:pPr>
+      <w:r>
+        <w:rPr>
+          <w:b w:val="0"/>
+          <w:sz w:val="24"/>
+          <w:rFonts w:eastAsia="宋体" w:ascii="Times New Roman" w:hAnsi="Times New Roman"/>
+        </w:rPr>
+        <w:t>参考网络流布线中对通道容量和拥塞区域的建模思想，本文在A*布线之后增加拥塞统计层。程序将每条成功路径投影到网格单元，统计单元被多少条网络经过，并形成拥塞峰值和拥挤网格数量两个指标。拥塞峰值反映局部最严重的线束重叠程度，拥挤网格数量反映拥塞区域的空间范围。该处理没有完整实现最大流或最小费用流求解，但吸收了网络流论文中“先压缩布线空间、再利用容量信息指导路径选择”的思路，适合在本科毕业设计原型中作为轻量可解释的工程化改进。</w:t>
+      </w:r>
+    </w:p>
+    <w:p>
+      <w:pPr>
+        <w:spacing w:line="324" w:lineRule="auto" w:after="120"/>
+        <w:ind w:firstLine="420"/>
+      </w:pPr>
+      <w:r>
+        <w:rPr>
+          <w:b w:val="0"/>
+          <w:sz w:val="24"/>
+          <w:rFonts w:eastAsia="宋体" w:ascii="Times New Roman" w:hAnsi="Times New Roman"/>
+        </w:rPr>
+        <w:t>参考蚁群算法中信息素矩阵和拥挤区域挥发的思想，本文将已布线路径视为历史信息素：某网格被越多网络经过，后续网络通过该网格的代价越高。不同于传统单纯A*只考虑距离和障碍，拥塞感知A*在代价函数中加入动态拥塞项，并按估计线长由长到短逐线布线。这样长路径优先占据较稳定的通道，短路径随后根据实时拥塞图进行绕行。该机制本质上是一种简化拆线重布：先由PSO-Hanan方案给出紧凑布点，再用动态拥塞代价重构路径，以少量线长增加换取局部拥堵缓解。</w:t>
+      </w:r>
+    </w:p>
     <w:tbl>
       <w:tblPr>
         <w:tblStyle w:val="TableGrid"/>
@@ -1926,6 +1970,88 @@
                 <w:rFonts w:eastAsia="宋体" w:ascii="Times New Roman" w:hAnsi="Times New Roman"/>
               </w:rPr>
               <w:t>验证可达性并统计线长</w:t>
+            </w:r>
+          </w:p>
+        </w:tc>
+      </w:tr>
+      <w:tr>
+        <w:tc>
+          <w:tcPr>
+            <w:tcW w:type="dxa" w:w="1531"/>
+            <w:vAlign w:val="center"/>
+          </w:tcPr>
+          <w:p>
+            <w:pPr>
+              <w:jc w:val="center"/>
+            </w:pPr>
+            <w:r/>
+            <w:r>
+              <w:rPr>
+                <w:b w:val="0"/>
+                <w:sz w:val="21"/>
+                <w:rFonts w:eastAsia="宋体" w:ascii="Times New Roman" w:hAnsi="Times New Roman"/>
+              </w:rPr>
+              <w:t>拥塞重布线</w:t>
+            </w:r>
+          </w:p>
+        </w:tc>
+        <w:tc>
+          <w:tcPr>
+            <w:tcW w:type="dxa" w:w="2268"/>
+            <w:vAlign w:val="center"/>
+          </w:tcPr>
+          <w:p>
+            <w:pPr>
+              <w:jc w:val="center"/>
+            </w:pPr>
+            <w:r/>
+            <w:r>
+              <w:rPr>
+                <w:b w:val="0"/>
+                <w:sz w:val="21"/>
+                <w:rFonts w:eastAsia="宋体" w:ascii="Times New Roman" w:hAnsi="Times New Roman"/>
+              </w:rPr>
+              <w:t>预布线路径、拥塞图</w:t>
+            </w:r>
+          </w:p>
+        </w:tc>
+        <w:tc>
+          <w:tcPr>
+            <w:tcW w:type="dxa" w:w="1928"/>
+            <w:vAlign w:val="center"/>
+          </w:tcPr>
+          <w:p>
+            <w:pPr>
+              <w:jc w:val="center"/>
+            </w:pPr>
+            <w:r/>
+            <w:r>
+              <w:rPr>
+                <w:b w:val="0"/>
+                <w:sz w:val="21"/>
+                <w:rFonts w:eastAsia="宋体" w:ascii="Times New Roman" w:hAnsi="Times New Roman"/>
+              </w:rPr>
+              <w:t>低拥塞路径集合</w:t>
+            </w:r>
+          </w:p>
+        </w:tc>
+        <w:tc>
+          <w:tcPr>
+            <w:tcW w:type="dxa" w:w="2835"/>
+            <w:vAlign w:val="center"/>
+          </w:tcPr>
+          <w:p>
+            <w:pPr>
+              <w:jc w:val="center"/>
+            </w:pPr>
+            <w:r/>
+            <w:r>
+              <w:rPr>
+                <w:b w:val="0"/>
+                <w:sz w:val="21"/>
+                <w:rFonts w:eastAsia="宋体" w:ascii="Times New Roman" w:hAnsi="Times New Roman"/>
+              </w:rPr>
+              <w:t>降低局部重叠和通道热点</w:t>
             </w:r>
           </w:p>
         </w:tc>
@@ -2520,7 +2646,7 @@
           <w:sz w:val="24"/>
           <w:rFonts w:eastAsia="宋体" w:ascii="Times New Roman" w:hAnsi="Times New Roman"/>
         </w:rPr>
-        <w:t>布点阶段由place_baseline、place_optimized和place_pso_hanan三个函数分别实现。第一组按照规则行列方式放置测试点，用作人工经验方案的近似基线；第二组先根据金手指横向位置分配目标带，再对候选点进行贪心选择和局部禁忌调整；第三组参考PSO与Hanan点优化思想，用粒子群搜索布点参数，并在候选点选择中综合线长、面积和间距代价。这样设计的原因是，毕业设计不仅需要展示优化方案效果，也需要有可复现的多层次对照组。若只给出单一优化结果而没有基线，无法说明算法相对传统规则设计的改进幅度；若基线过于复杂，又会模糊本文方法的贡献边界。</w:t>
+        <w:t>布点阶段由place_baseline、place_optimized和place_pso_hanan三个函数分别实现。第一组按照规则行列方式放置测试点，用作人工经验方案的近似基线；第二组先根据金手指横向位置分配目标带，再对候选点进行贪心选择和局部禁忌调整；第三组参考PSO与Hanan点优化思想，用粒子群搜索布点参数，并在候选点选择中综合线长、面积和间距代价。PSO实现采用递减惯性权重，使前期具有更强探索能力，后期逐步收敛到稳定参数组合。</w:t>
       </w:r>
     </w:p>
     <w:p>
@@ -2534,7 +2660,7 @@
           <w:sz w:val="24"/>
           <w:rFonts w:eastAsia="宋体" w:ascii="Times New Roman" w:hAnsi="Times New Roman"/>
         </w:rPr>
-        <w:t>布线阶段由astar和route_all函数完成。astar函数在网格图上搜索单个网络路径，障碍区域被视为不可访问节点；route_all函数依次处理所有测试点，并将路径结果整理为Route集合。evaluate函数对布点和布线结果进行统一评价，计算覆盖率、布通率、面积占比、总线长、违规数和运行时间。write_csvs和write_svg函数则负责把结果落盘，形成论文可引用的数据和图示。整个流程保持输入、计算、输出分离，便于后续把当前命令行原型升级为图形界面或EDA插件。</w:t>
+        <w:t>布线阶段由astar、route_all和route_all_congestion_aware函数完成。astar函数在网格图上搜索单个网络路径，障碍区域被视为不可访问节点；route_all函数依次处理所有测试点，并将路径结果整理为Route集合；route_all_congestion_aware函数则在预布线结果基础上构建动态拥塞图，将历史路径占用作为类似蚁群信息素的代价项，引导后续网络避开热点区域。evaluate函数对布点和布线结果进行统一评价，除覆盖率、布通率、面积占比、总线长和违规数外，还统计拥塞峰值和拥挤网格数量。write_csvs和write_svg函数负责把结果落盘，形成论文可引用的数据和图示。</w:t>
       </w:r>
     </w:p>
     <w:p>
@@ -3362,22 +3488,19 @@
         <w:tblLook w:firstColumn="1" w:firstRow="1" w:lastColumn="0" w:lastRow="0" w:noHBand="0" w:noVBand="1" w:val="04A0"/>
       </w:tblPr>
       <w:tblGrid>
-        <w:gridCol w:w="825"/>
-        <w:gridCol w:w="825"/>
-        <w:gridCol w:w="825"/>
-        <w:gridCol w:w="825"/>
-        <w:gridCol w:w="825"/>
-        <w:gridCol w:w="825"/>
-        <w:gridCol w:w="825"/>
-        <w:gridCol w:w="825"/>
-        <w:gridCol w:w="825"/>
-        <w:gridCol w:w="825"/>
-        <w:gridCol w:w="825"/>
+        <w:gridCol w:w="1134"/>
+        <w:gridCol w:w="1134"/>
+        <w:gridCol w:w="1134"/>
+        <w:gridCol w:w="1134"/>
+        <w:gridCol w:w="1134"/>
+        <w:gridCol w:w="1134"/>
+        <w:gridCol w:w="1134"/>
+        <w:gridCol w:w="1134"/>
       </w:tblGrid>
       <w:tr>
         <w:tc>
           <w:tcPr>
-            <w:tcW w:type="dxa" w:w="1077"/>
+            <w:tcW w:type="dxa" w:w="1134"/>
             <w:vAlign w:val="center"/>
             <w:shd w:fill="EAF2F8"/>
           </w:tcPr>
@@ -3398,7 +3521,7 @@
         </w:tc>
         <w:tc>
           <w:tcPr>
-            <w:tcW w:type="dxa" w:w="794"/>
+            <w:tcW w:type="dxa" w:w="1361"/>
             <w:vAlign w:val="center"/>
             <w:shd w:fill="EAF2F8"/>
           </w:tcPr>
@@ -3413,13 +3536,13 @@
                 <w:sz w:val="21"/>
                 <w:rFonts w:eastAsia="宋体" w:ascii="Times New Roman" w:hAnsi="Times New Roman"/>
               </w:rPr>
-              <w:t>基线布通/%</w:t>
+              <w:t>算法</w:t>
             </w:r>
           </w:p>
         </w:tc>
         <w:tc>
           <w:tcPr>
-            <w:tcW w:type="dxa" w:w="850"/>
+            <w:tcW w:type="dxa" w:w="1020"/>
             <w:vAlign w:val="center"/>
             <w:shd w:fill="EAF2F8"/>
           </w:tcPr>
@@ -3434,7 +3557,91 @@
                 <w:sz w:val="21"/>
                 <w:rFonts w:eastAsia="宋体" w:ascii="Times New Roman" w:hAnsi="Times New Roman"/>
               </w:rPr>
-              <w:t>K-means布通/%</w:t>
+              <w:t>布通/%</w:t>
+            </w:r>
+          </w:p>
+        </w:tc>
+        <w:tc>
+          <w:tcPr>
+            <w:tcW w:type="dxa" w:w="1020"/>
+            <w:vAlign w:val="center"/>
+            <w:shd w:fill="EAF2F8"/>
+          </w:tcPr>
+          <w:p>
+            <w:pPr>
+              <w:jc w:val="center"/>
+            </w:pPr>
+            <w:r/>
+            <w:r>
+              <w:rPr>
+                <w:b/>
+                <w:sz w:val="21"/>
+                <w:rFonts w:eastAsia="宋体" w:ascii="Times New Roman" w:hAnsi="Times New Roman"/>
+              </w:rPr>
+              <w:t>面积/%</w:t>
+            </w:r>
+          </w:p>
+        </w:tc>
+        <w:tc>
+          <w:tcPr>
+            <w:tcW w:type="dxa" w:w="1134"/>
+            <w:vAlign w:val="center"/>
+            <w:shd w:fill="EAF2F8"/>
+          </w:tcPr>
+          <w:p>
+            <w:pPr>
+              <w:jc w:val="center"/>
+            </w:pPr>
+            <w:r/>
+            <w:r>
+              <w:rPr>
+                <w:b/>
+                <w:sz w:val="21"/>
+                <w:rFonts w:eastAsia="宋体" w:ascii="Times New Roman" w:hAnsi="Times New Roman"/>
+              </w:rPr>
+              <w:t>线长/mm</w:t>
+            </w:r>
+          </w:p>
+        </w:tc>
+        <w:tc>
+          <w:tcPr>
+            <w:tcW w:type="dxa" w:w="1020"/>
+            <w:vAlign w:val="center"/>
+            <w:shd w:fill="EAF2F8"/>
+          </w:tcPr>
+          <w:p>
+            <w:pPr>
+              <w:jc w:val="center"/>
+            </w:pPr>
+            <w:r/>
+            <w:r>
+              <w:rPr>
+                <w:b/>
+                <w:sz w:val="21"/>
+                <w:rFonts w:eastAsia="宋体" w:ascii="Times New Roman" w:hAnsi="Times New Roman"/>
+              </w:rPr>
+              <w:t>拥塞峰值</w:t>
+            </w:r>
+          </w:p>
+        </w:tc>
+        <w:tc>
+          <w:tcPr>
+            <w:tcW w:type="dxa" w:w="1020"/>
+            <w:vAlign w:val="center"/>
+            <w:shd w:fill="EAF2F8"/>
+          </w:tcPr>
+          <w:p>
+            <w:pPr>
+              <w:jc w:val="center"/>
+            </w:pPr>
+            <w:r/>
+            <w:r>
+              <w:rPr>
+                <w:b/>
+                <w:sz w:val="21"/>
+                <w:rFonts w:eastAsia="宋体" w:ascii="Times New Roman" w:hAnsi="Times New Roman"/>
+              </w:rPr>
+              <w:t>拥挤网格</w:t>
             </w:r>
           </w:p>
         </w:tc>
@@ -3455,154 +3662,7 @@
                 <w:sz w:val="21"/>
                 <w:rFonts w:eastAsia="宋体" w:ascii="Times New Roman" w:hAnsi="Times New Roman"/>
               </w:rPr>
-              <w:t>PSO布通/%</w:t>
-            </w:r>
-          </w:p>
-        </w:tc>
-        <w:tc>
-          <w:tcPr>
-            <w:tcW w:type="dxa" w:w="794"/>
-            <w:vAlign w:val="center"/>
-            <w:shd w:fill="EAF2F8"/>
-          </w:tcPr>
-          <w:p>
-            <w:pPr>
-              <w:jc w:val="center"/>
-            </w:pPr>
-            <w:r/>
-            <w:r>
-              <w:rPr>
-                <w:b/>
-                <w:sz w:val="21"/>
-                <w:rFonts w:eastAsia="宋体" w:ascii="Times New Roman" w:hAnsi="Times New Roman"/>
-              </w:rPr>
-              <w:t>基线面积/%</w:t>
-            </w:r>
-          </w:p>
-        </w:tc>
-        <w:tc>
-          <w:tcPr>
-            <w:tcW w:type="dxa" w:w="850"/>
-            <w:vAlign w:val="center"/>
-            <w:shd w:fill="EAF2F8"/>
-          </w:tcPr>
-          <w:p>
-            <w:pPr>
-              <w:jc w:val="center"/>
-            </w:pPr>
-            <w:r/>
-            <w:r>
-              <w:rPr>
-                <w:b/>
-                <w:sz w:val="21"/>
-                <w:rFonts w:eastAsia="宋体" w:ascii="Times New Roman" w:hAnsi="Times New Roman"/>
-              </w:rPr>
-              <w:t>K-means面积/%</w:t>
-            </w:r>
-          </w:p>
-        </w:tc>
-        <w:tc>
-          <w:tcPr>
-            <w:tcW w:type="dxa" w:w="794"/>
-            <w:vAlign w:val="center"/>
-            <w:shd w:fill="EAF2F8"/>
-          </w:tcPr>
-          <w:p>
-            <w:pPr>
-              <w:jc w:val="center"/>
-            </w:pPr>
-            <w:r/>
-            <w:r>
-              <w:rPr>
-                <w:b/>
-                <w:sz w:val="21"/>
-                <w:rFonts w:eastAsia="宋体" w:ascii="Times New Roman" w:hAnsi="Times New Roman"/>
-              </w:rPr>
-              <w:t>PSO面积/%</w:t>
-            </w:r>
-          </w:p>
-        </w:tc>
-        <w:tc>
-          <w:tcPr>
-            <w:tcW w:type="dxa" w:w="907"/>
-            <w:vAlign w:val="center"/>
-            <w:shd w:fill="EAF2F8"/>
-          </w:tcPr>
-          <w:p>
-            <w:pPr>
-              <w:jc w:val="center"/>
-            </w:pPr>
-            <w:r/>
-            <w:r>
-              <w:rPr>
-                <w:b/>
-                <w:sz w:val="21"/>
-                <w:rFonts w:eastAsia="宋体" w:ascii="Times New Roman" w:hAnsi="Times New Roman"/>
-              </w:rPr>
-              <w:t>基线线长/mm</w:t>
-            </w:r>
-          </w:p>
-        </w:tc>
-        <w:tc>
-          <w:tcPr>
-            <w:tcW w:type="dxa" w:w="907"/>
-            <w:vAlign w:val="center"/>
-            <w:shd w:fill="EAF2F8"/>
-          </w:tcPr>
-          <w:p>
-            <w:pPr>
-              <w:jc w:val="center"/>
-            </w:pPr>
-            <w:r/>
-            <w:r>
-              <w:rPr>
-                <w:b/>
-                <w:sz w:val="21"/>
-                <w:rFonts w:eastAsia="宋体" w:ascii="Times New Roman" w:hAnsi="Times New Roman"/>
-              </w:rPr>
-              <w:t>K-means线长/mm</w:t>
-            </w:r>
-          </w:p>
-        </w:tc>
-        <w:tc>
-          <w:tcPr>
-            <w:tcW w:type="dxa" w:w="850"/>
-            <w:vAlign w:val="center"/>
-            <w:shd w:fill="EAF2F8"/>
-          </w:tcPr>
-          <w:p>
-            <w:pPr>
-              <w:jc w:val="center"/>
-            </w:pPr>
-            <w:r/>
-            <w:r>
-              <w:rPr>
-                <w:b/>
-                <w:sz w:val="21"/>
-                <w:rFonts w:eastAsia="宋体" w:ascii="Times New Roman" w:hAnsi="Times New Roman"/>
-              </w:rPr>
-              <w:t>PSO线长/mm</w:t>
-            </w:r>
-          </w:p>
-        </w:tc>
-        <w:tc>
-          <w:tcPr>
-            <w:tcW w:type="dxa" w:w="907"/>
-            <w:vAlign w:val="center"/>
-            <w:shd w:fill="EAF2F8"/>
-          </w:tcPr>
-          <w:p>
-            <w:pPr>
-              <w:jc w:val="center"/>
-            </w:pPr>
-            <w:r/>
-            <w:r>
-              <w:rPr>
-                <w:b/>
-                <w:sz w:val="21"/>
-                <w:rFonts w:eastAsia="宋体" w:ascii="Times New Roman" w:hAnsi="Times New Roman"/>
-              </w:rPr>
-              <w:t>违规 基线/PSO</w:t>
+              <w:t>违规</w:t>
             </w:r>
           </w:p>
         </w:tc>
@@ -3610,7 +3670,7 @@
       <w:tr>
         <w:tc>
           <w:tcPr>
-            <w:tcW w:type="dxa" w:w="1077"/>
+            <w:tcW w:type="dxa" w:w="1134"/>
             <w:vAlign w:val="center"/>
           </w:tcPr>
           <w:p>
@@ -3630,7 +3690,27 @@
         </w:tc>
         <w:tc>
           <w:tcPr>
-            <w:tcW w:type="dxa" w:w="794"/>
+            <w:tcW w:type="dxa" w:w="1361"/>
+            <w:vAlign w:val="center"/>
+          </w:tcPr>
+          <w:p>
+            <w:pPr>
+              <w:jc w:val="center"/>
+            </w:pPr>
+            <w:r/>
+            <w:r>
+              <w:rPr>
+                <w:b w:val="0"/>
+                <w:sz w:val="21"/>
+                <w:rFonts w:eastAsia="宋体" w:ascii="Times New Roman" w:hAnsi="Times New Roman"/>
+              </w:rPr>
+              <w:t>基线规则</w:t>
+            </w:r>
+          </w:p>
+        </w:tc>
+        <w:tc>
+          <w:tcPr>
+            <w:tcW w:type="dxa" w:w="1020"/>
             <w:vAlign w:val="center"/>
           </w:tcPr>
           <w:p>
@@ -3650,7 +3730,149 @@
         </w:tc>
         <w:tc>
           <w:tcPr>
-            <w:tcW w:type="dxa" w:w="850"/>
+            <w:tcW w:type="dxa" w:w="1020"/>
+            <w:vAlign w:val="center"/>
+          </w:tcPr>
+          <w:p>
+            <w:pPr>
+              <w:jc w:val="center"/>
+            </w:pPr>
+            <w:r/>
+            <w:r>
+              <w:rPr>
+                <w:b w:val="0"/>
+                <w:sz w:val="21"/>
+                <w:rFonts w:eastAsia="宋体" w:ascii="Times New Roman" w:hAnsi="Times New Roman"/>
+              </w:rPr>
+              <w:t>48.15</w:t>
+            </w:r>
+          </w:p>
+        </w:tc>
+        <w:tc>
+          <w:tcPr>
+            <w:tcW w:type="dxa" w:w="1134"/>
+            <w:vAlign w:val="center"/>
+          </w:tcPr>
+          <w:p>
+            <w:pPr>
+              <w:jc w:val="center"/>
+            </w:pPr>
+            <w:r/>
+            <w:r>
+              <w:rPr>
+                <w:b w:val="0"/>
+                <w:sz w:val="21"/>
+                <w:rFonts w:eastAsia="宋体" w:ascii="Times New Roman" w:hAnsi="Times New Roman"/>
+              </w:rPr>
+              <w:t>816.00</w:t>
+            </w:r>
+          </w:p>
+        </w:tc>
+        <w:tc>
+          <w:tcPr>
+            <w:tcW w:type="dxa" w:w="1020"/>
+            <w:vAlign w:val="center"/>
+          </w:tcPr>
+          <w:p>
+            <w:pPr>
+              <w:jc w:val="center"/>
+            </w:pPr>
+            <w:r/>
+            <w:r>
+              <w:rPr>
+                <w:b w:val="0"/>
+                <w:sz w:val="21"/>
+                <w:rFonts w:eastAsia="宋体" w:ascii="Times New Roman" w:hAnsi="Times New Roman"/>
+              </w:rPr>
+              <w:t>1</w:t>
+            </w:r>
+          </w:p>
+        </w:tc>
+        <w:tc>
+          <w:tcPr>
+            <w:tcW w:type="dxa" w:w="1020"/>
+            <w:vAlign w:val="center"/>
+          </w:tcPr>
+          <w:p>
+            <w:pPr>
+              <w:jc w:val="center"/>
+            </w:pPr>
+            <w:r/>
+            <w:r>
+              <w:rPr>
+                <w:b w:val="0"/>
+                <w:sz w:val="21"/>
+                <w:rFonts w:eastAsia="宋体" w:ascii="Times New Roman" w:hAnsi="Times New Roman"/>
+              </w:rPr>
+              <w:t>0</w:t>
+            </w:r>
+          </w:p>
+        </w:tc>
+        <w:tc>
+          <w:tcPr>
+            <w:tcW w:type="dxa" w:w="794"/>
+            <w:vAlign w:val="center"/>
+          </w:tcPr>
+          <w:p>
+            <w:pPr>
+              <w:jc w:val="center"/>
+            </w:pPr>
+            <w:r/>
+            <w:r>
+              <w:rPr>
+                <w:b w:val="0"/>
+                <w:sz w:val="21"/>
+                <w:rFonts w:eastAsia="宋体" w:ascii="Times New Roman" w:hAnsi="Times New Roman"/>
+              </w:rPr>
+              <w:t>0</w:t>
+            </w:r>
+          </w:p>
+        </w:tc>
+      </w:tr>
+      <w:tr>
+        <w:tc>
+          <w:tcPr>
+            <w:tcW w:type="dxa" w:w="1134"/>
+            <w:vAlign w:val="center"/>
+          </w:tcPr>
+          <w:p>
+            <w:pPr>
+              <w:jc w:val="center"/>
+            </w:pPr>
+            <w:r/>
+            <w:r>
+              <w:rPr>
+                <w:b w:val="0"/>
+                <w:sz w:val="21"/>
+                <w:rFonts w:eastAsia="宋体" w:ascii="Times New Roman" w:hAnsi="Times New Roman"/>
+              </w:rPr>
+              <w:t>case_01</w:t>
+            </w:r>
+          </w:p>
+        </w:tc>
+        <w:tc>
+          <w:tcPr>
+            <w:tcW w:type="dxa" w:w="1361"/>
+            <w:vAlign w:val="center"/>
+          </w:tcPr>
+          <w:p>
+            <w:pPr>
+              <w:jc w:val="center"/>
+            </w:pPr>
+            <w:r/>
+            <w:r>
+              <w:rPr>
+                <w:b w:val="0"/>
+                <w:sz w:val="21"/>
+                <w:rFonts w:eastAsia="宋体" w:ascii="Times New Roman" w:hAnsi="Times New Roman"/>
+              </w:rPr>
+              <w:t>K-means</w:t>
+            </w:r>
+          </w:p>
+        </w:tc>
+        <w:tc>
+          <w:tcPr>
+            <w:tcW w:type="dxa" w:w="1020"/>
             <w:vAlign w:val="center"/>
           </w:tcPr>
           <w:p>
@@ -3670,7 +3892,149 @@
         </w:tc>
         <w:tc>
           <w:tcPr>
+            <w:tcW w:type="dxa" w:w="1020"/>
+            <w:vAlign w:val="center"/>
+          </w:tcPr>
+          <w:p>
+            <w:pPr>
+              <w:jc w:val="center"/>
+            </w:pPr>
+            <w:r/>
+            <w:r>
+              <w:rPr>
+                <w:b w:val="0"/>
+                <w:sz w:val="21"/>
+                <w:rFonts w:eastAsia="宋体" w:ascii="Times New Roman" w:hAnsi="Times New Roman"/>
+              </w:rPr>
+              <w:t>9.05</w:t>
+            </w:r>
+          </w:p>
+        </w:tc>
+        <w:tc>
+          <w:tcPr>
+            <w:tcW w:type="dxa" w:w="1134"/>
+            <w:vAlign w:val="center"/>
+          </w:tcPr>
+          <w:p>
+            <w:pPr>
+              <w:jc w:val="center"/>
+            </w:pPr>
+            <w:r/>
+            <w:r>
+              <w:rPr>
+                <w:b w:val="0"/>
+                <w:sz w:val="21"/>
+                <w:rFonts w:eastAsia="宋体" w:ascii="Times New Roman" w:hAnsi="Times New Roman"/>
+              </w:rPr>
+              <w:t>345.00</w:t>
+            </w:r>
+          </w:p>
+        </w:tc>
+        <w:tc>
+          <w:tcPr>
+            <w:tcW w:type="dxa" w:w="1020"/>
+            <w:vAlign w:val="center"/>
+          </w:tcPr>
+          <w:p>
+            <w:pPr>
+              <w:jc w:val="center"/>
+            </w:pPr>
+            <w:r/>
+            <w:r>
+              <w:rPr>
+                <w:b w:val="0"/>
+                <w:sz w:val="21"/>
+                <w:rFonts w:eastAsia="宋体" w:ascii="Times New Roman" w:hAnsi="Times New Roman"/>
+              </w:rPr>
+              <w:t>2</w:t>
+            </w:r>
+          </w:p>
+        </w:tc>
+        <w:tc>
+          <w:tcPr>
+            <w:tcW w:type="dxa" w:w="1020"/>
+            <w:vAlign w:val="center"/>
+          </w:tcPr>
+          <w:p>
+            <w:pPr>
+              <w:jc w:val="center"/>
+            </w:pPr>
+            <w:r/>
+            <w:r>
+              <w:rPr>
+                <w:b w:val="0"/>
+                <w:sz w:val="21"/>
+                <w:rFonts w:eastAsia="宋体" w:ascii="Times New Roman" w:hAnsi="Times New Roman"/>
+              </w:rPr>
+              <w:t>64</w:t>
+            </w:r>
+          </w:p>
+        </w:tc>
+        <w:tc>
+          <w:tcPr>
             <w:tcW w:type="dxa" w:w="794"/>
+            <w:vAlign w:val="center"/>
+          </w:tcPr>
+          <w:p>
+            <w:pPr>
+              <w:jc w:val="center"/>
+            </w:pPr>
+            <w:r/>
+            <w:r>
+              <w:rPr>
+                <w:b w:val="0"/>
+                <w:sz w:val="21"/>
+                <w:rFonts w:eastAsia="宋体" w:ascii="Times New Roman" w:hAnsi="Times New Roman"/>
+              </w:rPr>
+              <w:t>0</w:t>
+            </w:r>
+          </w:p>
+        </w:tc>
+      </w:tr>
+      <w:tr>
+        <w:tc>
+          <w:tcPr>
+            <w:tcW w:type="dxa" w:w="1134"/>
+            <w:vAlign w:val="center"/>
+          </w:tcPr>
+          <w:p>
+            <w:pPr>
+              <w:jc w:val="center"/>
+            </w:pPr>
+            <w:r/>
+            <w:r>
+              <w:rPr>
+                <w:b w:val="0"/>
+                <w:sz w:val="21"/>
+                <w:rFonts w:eastAsia="宋体" w:ascii="Times New Roman" w:hAnsi="Times New Roman"/>
+              </w:rPr>
+              <w:t>case_01</w:t>
+            </w:r>
+          </w:p>
+        </w:tc>
+        <w:tc>
+          <w:tcPr>
+            <w:tcW w:type="dxa" w:w="1361"/>
+            <w:vAlign w:val="center"/>
+          </w:tcPr>
+          <w:p>
+            <w:pPr>
+              <w:jc w:val="center"/>
+            </w:pPr>
+            <w:r/>
+            <w:r>
+              <w:rPr>
+                <w:b w:val="0"/>
+                <w:sz w:val="21"/>
+                <w:rFonts w:eastAsia="宋体" w:ascii="Times New Roman" w:hAnsi="Times New Roman"/>
+              </w:rPr>
+              <w:t>PSO-Hanan</w:t>
+            </w:r>
+          </w:p>
+        </w:tc>
+        <w:tc>
+          <w:tcPr>
+            <w:tcW w:type="dxa" w:w="1020"/>
             <w:vAlign w:val="center"/>
           </w:tcPr>
           <w:p>
@@ -3690,7 +4054,7 @@
         </w:tc>
         <w:tc>
           <w:tcPr>
-            <w:tcW w:type="dxa" w:w="794"/>
+            <w:tcW w:type="dxa" w:w="1020"/>
             <w:vAlign w:val="center"/>
           </w:tcPr>
           <w:p>
@@ -3704,13 +4068,13 @@
                 <w:sz w:val="21"/>
                 <w:rFonts w:eastAsia="宋体" w:ascii="Times New Roman" w:hAnsi="Times New Roman"/>
               </w:rPr>
-              <w:t>48.15</w:t>
+              <w:t>8.89</w:t>
             </w:r>
           </w:p>
         </w:tc>
         <w:tc>
           <w:tcPr>
-            <w:tcW w:type="dxa" w:w="850"/>
+            <w:tcW w:type="dxa" w:w="1134"/>
             <w:vAlign w:val="center"/>
           </w:tcPr>
           <w:p>
@@ -3724,7 +4088,47 @@
                 <w:sz w:val="21"/>
                 <w:rFonts w:eastAsia="宋体" w:ascii="Times New Roman" w:hAnsi="Times New Roman"/>
               </w:rPr>
-              <w:t>9.05</w:t>
+              <w:t>323.00</w:t>
+            </w:r>
+          </w:p>
+        </w:tc>
+        <w:tc>
+          <w:tcPr>
+            <w:tcW w:type="dxa" w:w="1020"/>
+            <w:vAlign w:val="center"/>
+          </w:tcPr>
+          <w:p>
+            <w:pPr>
+              <w:jc w:val="center"/>
+            </w:pPr>
+            <w:r/>
+            <w:r>
+              <w:rPr>
+                <w:b w:val="0"/>
+                <w:sz w:val="21"/>
+                <w:rFonts w:eastAsia="宋体" w:ascii="Times New Roman" w:hAnsi="Times New Roman"/>
+              </w:rPr>
+              <w:t>2</w:t>
+            </w:r>
+          </w:p>
+        </w:tc>
+        <w:tc>
+          <w:tcPr>
+            <w:tcW w:type="dxa" w:w="1020"/>
+            <w:vAlign w:val="center"/>
+          </w:tcPr>
+          <w:p>
+            <w:pPr>
+              <w:jc w:val="center"/>
+            </w:pPr>
+            <w:r/>
+            <w:r>
+              <w:rPr>
+                <w:b w:val="0"/>
+                <w:sz w:val="21"/>
+                <w:rFonts w:eastAsia="宋体" w:ascii="Times New Roman" w:hAnsi="Times New Roman"/>
+              </w:rPr>
+              <w:t>8</w:t>
             </w:r>
           </w:p>
         </w:tc>
@@ -3744,13 +4148,15 @@
                 <w:sz w:val="21"/>
                 <w:rFonts w:eastAsia="宋体" w:ascii="Times New Roman" w:hAnsi="Times New Roman"/>
               </w:rPr>
-              <w:t>8.89</w:t>
+              <w:t>0</w:t>
             </w:r>
           </w:p>
         </w:tc>
+      </w:tr>
+      <w:tr>
         <w:tc>
           <w:tcPr>
-            <w:tcW w:type="dxa" w:w="907"/>
+            <w:tcW w:type="dxa" w:w="1134"/>
             <w:vAlign w:val="center"/>
           </w:tcPr>
           <w:p>
@@ -3764,13 +4170,13 @@
                 <w:sz w:val="21"/>
                 <w:rFonts w:eastAsia="宋体" w:ascii="Times New Roman" w:hAnsi="Times New Roman"/>
               </w:rPr>
-              <w:t>816.00</w:t>
+              <w:t>case_01</w:t>
             </w:r>
           </w:p>
         </w:tc>
         <w:tc>
           <w:tcPr>
-            <w:tcW w:type="dxa" w:w="907"/>
+            <w:tcW w:type="dxa" w:w="1361"/>
             <w:vAlign w:val="center"/>
           </w:tcPr>
           <w:p>
@@ -3784,13 +4190,13 @@
                 <w:sz w:val="21"/>
                 <w:rFonts w:eastAsia="宋体" w:ascii="Times New Roman" w:hAnsi="Times New Roman"/>
               </w:rPr>
-              <w:t>345.00</w:t>
+              <w:t>拥塞重布线</w:t>
             </w:r>
           </w:p>
         </w:tc>
         <w:tc>
           <w:tcPr>
-            <w:tcW w:type="dxa" w:w="850"/>
+            <w:tcW w:type="dxa" w:w="1020"/>
             <w:vAlign w:val="center"/>
           </w:tcPr>
           <w:p>
@@ -3804,13 +4210,13 @@
                 <w:sz w:val="21"/>
                 <w:rFonts w:eastAsia="宋体" w:ascii="Times New Roman" w:hAnsi="Times New Roman"/>
               </w:rPr>
-              <w:t>323.00</w:t>
+              <w:t>100.00</w:t>
             </w:r>
           </w:p>
         </w:tc>
         <w:tc>
           <w:tcPr>
-            <w:tcW w:type="dxa" w:w="907"/>
+            <w:tcW w:type="dxa" w:w="1020"/>
             <w:vAlign w:val="center"/>
           </w:tcPr>
           <w:p>
@@ -3824,7 +4230,87 @@
                 <w:sz w:val="21"/>
                 <w:rFonts w:eastAsia="宋体" w:ascii="Times New Roman" w:hAnsi="Times New Roman"/>
               </w:rPr>
-              <w:t>0/0</w:t>
+              <w:t>8.89</w:t>
+            </w:r>
+          </w:p>
+        </w:tc>
+        <w:tc>
+          <w:tcPr>
+            <w:tcW w:type="dxa" w:w="1134"/>
+            <w:vAlign w:val="center"/>
+          </w:tcPr>
+          <w:p>
+            <w:pPr>
+              <w:jc w:val="center"/>
+            </w:pPr>
+            <w:r/>
+            <w:r>
+              <w:rPr>
+                <w:b w:val="0"/>
+                <w:sz w:val="21"/>
+                <w:rFonts w:eastAsia="宋体" w:ascii="Times New Roman" w:hAnsi="Times New Roman"/>
+              </w:rPr>
+              <w:t>327.00</w:t>
+            </w:r>
+          </w:p>
+        </w:tc>
+        <w:tc>
+          <w:tcPr>
+            <w:tcW w:type="dxa" w:w="1020"/>
+            <w:vAlign w:val="center"/>
+          </w:tcPr>
+          <w:p>
+            <w:pPr>
+              <w:jc w:val="center"/>
+            </w:pPr>
+            <w:r/>
+            <w:r>
+              <w:rPr>
+                <w:b w:val="0"/>
+                <w:sz w:val="21"/>
+                <w:rFonts w:eastAsia="宋体" w:ascii="Times New Roman" w:hAnsi="Times New Roman"/>
+              </w:rPr>
+              <w:t>2</w:t>
+            </w:r>
+          </w:p>
+        </w:tc>
+        <w:tc>
+          <w:tcPr>
+            <w:tcW w:type="dxa" w:w="1020"/>
+            <w:vAlign w:val="center"/>
+          </w:tcPr>
+          <w:p>
+            <w:pPr>
+              <w:jc w:val="center"/>
+            </w:pPr>
+            <w:r/>
+            <w:r>
+              <w:rPr>
+                <w:b w:val="0"/>
+                <w:sz w:val="21"/>
+                <w:rFonts w:eastAsia="宋体" w:ascii="Times New Roman" w:hAnsi="Times New Roman"/>
+              </w:rPr>
+              <w:t>8</w:t>
+            </w:r>
+          </w:p>
+        </w:tc>
+        <w:tc>
+          <w:tcPr>
+            <w:tcW w:type="dxa" w:w="794"/>
+            <w:vAlign w:val="center"/>
+          </w:tcPr>
+          <w:p>
+            <w:pPr>
+              <w:jc w:val="center"/>
+            </w:pPr>
+            <w:r/>
+            <w:r>
+              <w:rPr>
+                <w:b w:val="0"/>
+                <w:sz w:val="21"/>
+                <w:rFonts w:eastAsia="宋体" w:ascii="Times New Roman" w:hAnsi="Times New Roman"/>
+              </w:rPr>
+              <w:t>0</w:t>
             </w:r>
           </w:p>
         </w:tc>
@@ -3832,7 +4318,7 @@
       <w:tr>
         <w:tc>
           <w:tcPr>
-            <w:tcW w:type="dxa" w:w="1077"/>
+            <w:tcW w:type="dxa" w:w="1134"/>
             <w:vAlign w:val="center"/>
           </w:tcPr>
           <w:p>
@@ -3852,7 +4338,27 @@
         </w:tc>
         <w:tc>
           <w:tcPr>
-            <w:tcW w:type="dxa" w:w="794"/>
+            <w:tcW w:type="dxa" w:w="1361"/>
+            <w:vAlign w:val="center"/>
+          </w:tcPr>
+          <w:p>
+            <w:pPr>
+              <w:jc w:val="center"/>
+            </w:pPr>
+            <w:r/>
+            <w:r>
+              <w:rPr>
+                <w:b w:val="0"/>
+                <w:sz w:val="21"/>
+                <w:rFonts w:eastAsia="宋体" w:ascii="Times New Roman" w:hAnsi="Times New Roman"/>
+              </w:rPr>
+              <w:t>基线规则</w:t>
+            </w:r>
+          </w:p>
+        </w:tc>
+        <w:tc>
+          <w:tcPr>
+            <w:tcW w:type="dxa" w:w="1020"/>
             <w:vAlign w:val="center"/>
           </w:tcPr>
           <w:p>
@@ -3872,7 +4378,149 @@
         </w:tc>
         <w:tc>
           <w:tcPr>
-            <w:tcW w:type="dxa" w:w="850"/>
+            <w:tcW w:type="dxa" w:w="1020"/>
+            <w:vAlign w:val="center"/>
+          </w:tcPr>
+          <w:p>
+            <w:pPr>
+              <w:jc w:val="center"/>
+            </w:pPr>
+            <w:r/>
+            <w:r>
+              <w:rPr>
+                <w:b w:val="0"/>
+                <w:sz w:val="21"/>
+                <w:rFonts w:eastAsia="宋体" w:ascii="Times New Roman" w:hAnsi="Times New Roman"/>
+              </w:rPr>
+              <w:t>58.33</w:t>
+            </w:r>
+          </w:p>
+        </w:tc>
+        <w:tc>
+          <w:tcPr>
+            <w:tcW w:type="dxa" w:w="1134"/>
+            <w:vAlign w:val="center"/>
+          </w:tcPr>
+          <w:p>
+            <w:pPr>
+              <w:jc w:val="center"/>
+            </w:pPr>
+            <w:r/>
+            <w:r>
+              <w:rPr>
+                <w:b w:val="0"/>
+                <w:sz w:val="21"/>
+                <w:rFonts w:eastAsia="宋体" w:ascii="Times New Roman" w:hAnsi="Times New Roman"/>
+              </w:rPr>
+              <w:t>1940.00</w:t>
+            </w:r>
+          </w:p>
+        </w:tc>
+        <w:tc>
+          <w:tcPr>
+            <w:tcW w:type="dxa" w:w="1020"/>
+            <w:vAlign w:val="center"/>
+          </w:tcPr>
+          <w:p>
+            <w:pPr>
+              <w:jc w:val="center"/>
+            </w:pPr>
+            <w:r/>
+            <w:r>
+              <w:rPr>
+                <w:b w:val="0"/>
+                <w:sz w:val="21"/>
+                <w:rFonts w:eastAsia="宋体" w:ascii="Times New Roman" w:hAnsi="Times New Roman"/>
+              </w:rPr>
+              <w:t>2</w:t>
+            </w:r>
+          </w:p>
+        </w:tc>
+        <w:tc>
+          <w:tcPr>
+            <w:tcW w:type="dxa" w:w="1020"/>
+            <w:vAlign w:val="center"/>
+          </w:tcPr>
+          <w:p>
+            <w:pPr>
+              <w:jc w:val="center"/>
+            </w:pPr>
+            <w:r/>
+            <w:r>
+              <w:rPr>
+                <w:b w:val="0"/>
+                <w:sz w:val="21"/>
+                <w:rFonts w:eastAsia="宋体" w:ascii="Times New Roman" w:hAnsi="Times New Roman"/>
+              </w:rPr>
+              <w:t>378</w:t>
+            </w:r>
+          </w:p>
+        </w:tc>
+        <w:tc>
+          <w:tcPr>
+            <w:tcW w:type="dxa" w:w="794"/>
+            <w:vAlign w:val="center"/>
+          </w:tcPr>
+          <w:p>
+            <w:pPr>
+              <w:jc w:val="center"/>
+            </w:pPr>
+            <w:r/>
+            <w:r>
+              <w:rPr>
+                <w:b w:val="0"/>
+                <w:sz w:val="21"/>
+                <w:rFonts w:eastAsia="宋体" w:ascii="Times New Roman" w:hAnsi="Times New Roman"/>
+              </w:rPr>
+              <w:t>0</w:t>
+            </w:r>
+          </w:p>
+        </w:tc>
+      </w:tr>
+      <w:tr>
+        <w:tc>
+          <w:tcPr>
+            <w:tcW w:type="dxa" w:w="1134"/>
+            <w:vAlign w:val="center"/>
+          </w:tcPr>
+          <w:p>
+            <w:pPr>
+              <w:jc w:val="center"/>
+            </w:pPr>
+            <w:r/>
+            <w:r>
+              <w:rPr>
+                <w:b w:val="0"/>
+                <w:sz w:val="21"/>
+                <w:rFonts w:eastAsia="宋体" w:ascii="Times New Roman" w:hAnsi="Times New Roman"/>
+              </w:rPr>
+              <w:t>case_02</w:t>
+            </w:r>
+          </w:p>
+        </w:tc>
+        <w:tc>
+          <w:tcPr>
+            <w:tcW w:type="dxa" w:w="1361"/>
+            <w:vAlign w:val="center"/>
+          </w:tcPr>
+          <w:p>
+            <w:pPr>
+              <w:jc w:val="center"/>
+            </w:pPr>
+            <w:r/>
+            <w:r>
+              <w:rPr>
+                <w:b w:val="0"/>
+                <w:sz w:val="21"/>
+                <w:rFonts w:eastAsia="宋体" w:ascii="Times New Roman" w:hAnsi="Times New Roman"/>
+              </w:rPr>
+              <w:t>K-means</w:t>
+            </w:r>
+          </w:p>
+        </w:tc>
+        <w:tc>
+          <w:tcPr>
+            <w:tcW w:type="dxa" w:w="1020"/>
             <w:vAlign w:val="center"/>
           </w:tcPr>
           <w:p>
@@ -3892,7 +4540,149 @@
         </w:tc>
         <w:tc>
           <w:tcPr>
+            <w:tcW w:type="dxa" w:w="1020"/>
+            <w:vAlign w:val="center"/>
+          </w:tcPr>
+          <w:p>
+            <w:pPr>
+              <w:jc w:val="center"/>
+            </w:pPr>
+            <w:r/>
+            <w:r>
+              <w:rPr>
+                <w:b w:val="0"/>
+                <w:sz w:val="21"/>
+                <w:rFonts w:eastAsia="宋体" w:ascii="Times New Roman" w:hAnsi="Times New Roman"/>
+              </w:rPr>
+              <w:t>12.15</w:t>
+            </w:r>
+          </w:p>
+        </w:tc>
+        <w:tc>
+          <w:tcPr>
+            <w:tcW w:type="dxa" w:w="1134"/>
+            <w:vAlign w:val="center"/>
+          </w:tcPr>
+          <w:p>
+            <w:pPr>
+              <w:jc w:val="center"/>
+            </w:pPr>
+            <w:r/>
+            <w:r>
+              <w:rPr>
+                <w:b w:val="0"/>
+                <w:sz w:val="21"/>
+                <w:rFonts w:eastAsia="宋体" w:ascii="Times New Roman" w:hAnsi="Times New Roman"/>
+              </w:rPr>
+              <w:t>774.00</w:t>
+            </w:r>
+          </w:p>
+        </w:tc>
+        <w:tc>
+          <w:tcPr>
+            <w:tcW w:type="dxa" w:w="1020"/>
+            <w:vAlign w:val="center"/>
+          </w:tcPr>
+          <w:p>
+            <w:pPr>
+              <w:jc w:val="center"/>
+            </w:pPr>
+            <w:r/>
+            <w:r>
+              <w:rPr>
+                <w:b w:val="0"/>
+                <w:sz w:val="21"/>
+                <w:rFonts w:eastAsia="宋体" w:ascii="Times New Roman" w:hAnsi="Times New Roman"/>
+              </w:rPr>
+              <w:t>4</w:t>
+            </w:r>
+          </w:p>
+        </w:tc>
+        <w:tc>
+          <w:tcPr>
+            <w:tcW w:type="dxa" w:w="1020"/>
+            <w:vAlign w:val="center"/>
+          </w:tcPr>
+          <w:p>
+            <w:pPr>
+              <w:jc w:val="center"/>
+            </w:pPr>
+            <w:r/>
+            <w:r>
+              <w:rPr>
+                <w:b w:val="0"/>
+                <w:sz w:val="21"/>
+                <w:rFonts w:eastAsia="宋体" w:ascii="Times New Roman" w:hAnsi="Times New Roman"/>
+              </w:rPr>
+              <w:t>237</w:t>
+            </w:r>
+          </w:p>
+        </w:tc>
+        <w:tc>
+          <w:tcPr>
             <w:tcW w:type="dxa" w:w="794"/>
+            <w:vAlign w:val="center"/>
+          </w:tcPr>
+          <w:p>
+            <w:pPr>
+              <w:jc w:val="center"/>
+            </w:pPr>
+            <w:r/>
+            <w:r>
+              <w:rPr>
+                <w:b w:val="0"/>
+                <w:sz w:val="21"/>
+                <w:rFonts w:eastAsia="宋体" w:ascii="Times New Roman" w:hAnsi="Times New Roman"/>
+              </w:rPr>
+              <w:t>0</w:t>
+            </w:r>
+          </w:p>
+        </w:tc>
+      </w:tr>
+      <w:tr>
+        <w:tc>
+          <w:tcPr>
+            <w:tcW w:type="dxa" w:w="1134"/>
+            <w:vAlign w:val="center"/>
+          </w:tcPr>
+          <w:p>
+            <w:pPr>
+              <w:jc w:val="center"/>
+            </w:pPr>
+            <w:r/>
+            <w:r>
+              <w:rPr>
+                <w:b w:val="0"/>
+                <w:sz w:val="21"/>
+                <w:rFonts w:eastAsia="宋体" w:ascii="Times New Roman" w:hAnsi="Times New Roman"/>
+              </w:rPr>
+              <w:t>case_02</w:t>
+            </w:r>
+          </w:p>
+        </w:tc>
+        <w:tc>
+          <w:tcPr>
+            <w:tcW w:type="dxa" w:w="1361"/>
+            <w:vAlign w:val="center"/>
+          </w:tcPr>
+          <w:p>
+            <w:pPr>
+              <w:jc w:val="center"/>
+            </w:pPr>
+            <w:r/>
+            <w:r>
+              <w:rPr>
+                <w:b w:val="0"/>
+                <w:sz w:val="21"/>
+                <w:rFonts w:eastAsia="宋体" w:ascii="Times New Roman" w:hAnsi="Times New Roman"/>
+              </w:rPr>
+              <w:t>PSO-Hanan</w:t>
+            </w:r>
+          </w:p>
+        </w:tc>
+        <w:tc>
+          <w:tcPr>
+            <w:tcW w:type="dxa" w:w="1020"/>
             <w:vAlign w:val="center"/>
           </w:tcPr>
           <w:p>
@@ -3912,7 +4702,7 @@
         </w:tc>
         <w:tc>
           <w:tcPr>
-            <w:tcW w:type="dxa" w:w="794"/>
+            <w:tcW w:type="dxa" w:w="1020"/>
             <w:vAlign w:val="center"/>
           </w:tcPr>
           <w:p>
@@ -3926,13 +4716,13 @@
                 <w:sz w:val="21"/>
                 <w:rFonts w:eastAsia="宋体" w:ascii="Times New Roman" w:hAnsi="Times New Roman"/>
               </w:rPr>
-              <w:t>58.33</w:t>
+              <w:t>12.85</w:t>
             </w:r>
           </w:p>
         </w:tc>
         <w:tc>
           <w:tcPr>
-            <w:tcW w:type="dxa" w:w="850"/>
+            <w:tcW w:type="dxa" w:w="1134"/>
             <w:vAlign w:val="center"/>
           </w:tcPr>
           <w:p>
@@ -3946,7 +4736,47 @@
                 <w:sz w:val="21"/>
                 <w:rFonts w:eastAsia="宋体" w:ascii="Times New Roman" w:hAnsi="Times New Roman"/>
               </w:rPr>
-              <w:t>12.15</w:t>
+              <w:t>723.00</w:t>
+            </w:r>
+          </w:p>
+        </w:tc>
+        <w:tc>
+          <w:tcPr>
+            <w:tcW w:type="dxa" w:w="1020"/>
+            <w:vAlign w:val="center"/>
+          </w:tcPr>
+          <w:p>
+            <w:pPr>
+              <w:jc w:val="center"/>
+            </w:pPr>
+            <w:r/>
+            <w:r>
+              <w:rPr>
+                <w:b w:val="0"/>
+                <w:sz w:val="21"/>
+                <w:rFonts w:eastAsia="宋体" w:ascii="Times New Roman" w:hAnsi="Times New Roman"/>
+              </w:rPr>
+              <w:t>3</w:t>
+            </w:r>
+          </w:p>
+        </w:tc>
+        <w:tc>
+          <w:tcPr>
+            <w:tcW w:type="dxa" w:w="1020"/>
+            <w:vAlign w:val="center"/>
+          </w:tcPr>
+          <w:p>
+            <w:pPr>
+              <w:jc w:val="center"/>
+            </w:pPr>
+            <w:r/>
+            <w:r>
+              <w:rPr>
+                <w:b w:val="0"/>
+                <w:sz w:val="21"/>
+                <w:rFonts w:eastAsia="宋体" w:ascii="Times New Roman" w:hAnsi="Times New Roman"/>
+              </w:rPr>
+              <w:t>255</w:t>
             </w:r>
           </w:p>
         </w:tc>
@@ -3966,13 +4796,15 @@
                 <w:sz w:val="21"/>
                 <w:rFonts w:eastAsia="宋体" w:ascii="Times New Roman" w:hAnsi="Times New Roman"/>
               </w:rPr>
-              <w:t>12.85</w:t>
+              <w:t>0</w:t>
             </w:r>
           </w:p>
         </w:tc>
+      </w:tr>
+      <w:tr>
         <w:tc>
           <w:tcPr>
-            <w:tcW w:type="dxa" w:w="907"/>
+            <w:tcW w:type="dxa" w:w="1134"/>
             <w:vAlign w:val="center"/>
           </w:tcPr>
           <w:p>
@@ -3986,13 +4818,13 @@
                 <w:sz w:val="21"/>
                 <w:rFonts w:eastAsia="宋体" w:ascii="Times New Roman" w:hAnsi="Times New Roman"/>
               </w:rPr>
-              <w:t>1940.00</w:t>
+              <w:t>case_02</w:t>
             </w:r>
           </w:p>
         </w:tc>
         <w:tc>
           <w:tcPr>
-            <w:tcW w:type="dxa" w:w="907"/>
+            <w:tcW w:type="dxa" w:w="1361"/>
             <w:vAlign w:val="center"/>
           </w:tcPr>
           <w:p>
@@ -4006,13 +4838,13 @@
                 <w:sz w:val="21"/>
                 <w:rFonts w:eastAsia="宋体" w:ascii="Times New Roman" w:hAnsi="Times New Roman"/>
               </w:rPr>
-              <w:t>774.00</w:t>
+              <w:t>拥塞重布线</w:t>
             </w:r>
           </w:p>
         </w:tc>
         <w:tc>
           <w:tcPr>
-            <w:tcW w:type="dxa" w:w="850"/>
+            <w:tcW w:type="dxa" w:w="1020"/>
             <w:vAlign w:val="center"/>
           </w:tcPr>
           <w:p>
@@ -4026,13 +4858,13 @@
                 <w:sz w:val="21"/>
                 <w:rFonts w:eastAsia="宋体" w:ascii="Times New Roman" w:hAnsi="Times New Roman"/>
               </w:rPr>
-              <w:t>723.00</w:t>
+              <w:t>100.00</w:t>
             </w:r>
           </w:p>
         </w:tc>
         <w:tc>
           <w:tcPr>
-            <w:tcW w:type="dxa" w:w="907"/>
+            <w:tcW w:type="dxa" w:w="1020"/>
             <w:vAlign w:val="center"/>
           </w:tcPr>
           <w:p>
@@ -4046,7 +4878,87 @@
                 <w:sz w:val="21"/>
                 <w:rFonts w:eastAsia="宋体" w:ascii="Times New Roman" w:hAnsi="Times New Roman"/>
               </w:rPr>
-              <w:t>0/0</w:t>
+              <w:t>12.85</w:t>
+            </w:r>
+          </w:p>
+        </w:tc>
+        <w:tc>
+          <w:tcPr>
+            <w:tcW w:type="dxa" w:w="1134"/>
+            <w:vAlign w:val="center"/>
+          </w:tcPr>
+          <w:p>
+            <w:pPr>
+              <w:jc w:val="center"/>
+            </w:pPr>
+            <w:r/>
+            <w:r>
+              <w:rPr>
+                <w:b w:val="0"/>
+                <w:sz w:val="21"/>
+                <w:rFonts w:eastAsia="宋体" w:ascii="Times New Roman" w:hAnsi="Times New Roman"/>
+              </w:rPr>
+              <w:t>763.00</w:t>
+            </w:r>
+          </w:p>
+        </w:tc>
+        <w:tc>
+          <w:tcPr>
+            <w:tcW w:type="dxa" w:w="1020"/>
+            <w:vAlign w:val="center"/>
+          </w:tcPr>
+          <w:p>
+            <w:pPr>
+              <w:jc w:val="center"/>
+            </w:pPr>
+            <w:r/>
+            <w:r>
+              <w:rPr>
+                <w:b w:val="0"/>
+                <w:sz w:val="21"/>
+                <w:rFonts w:eastAsia="宋体" w:ascii="Times New Roman" w:hAnsi="Times New Roman"/>
+              </w:rPr>
+              <w:t>3</w:t>
+            </w:r>
+          </w:p>
+        </w:tc>
+        <w:tc>
+          <w:tcPr>
+            <w:tcW w:type="dxa" w:w="1020"/>
+            <w:vAlign w:val="center"/>
+          </w:tcPr>
+          <w:p>
+            <w:pPr>
+              <w:jc w:val="center"/>
+            </w:pPr>
+            <w:r/>
+            <w:r>
+              <w:rPr>
+                <w:b w:val="0"/>
+                <w:sz w:val="21"/>
+                <w:rFonts w:eastAsia="宋体" w:ascii="Times New Roman" w:hAnsi="Times New Roman"/>
+              </w:rPr>
+              <w:t>185</w:t>
+            </w:r>
+          </w:p>
+        </w:tc>
+        <w:tc>
+          <w:tcPr>
+            <w:tcW w:type="dxa" w:w="794"/>
+            <w:vAlign w:val="center"/>
+          </w:tcPr>
+          <w:p>
+            <w:pPr>
+              <w:jc w:val="center"/>
+            </w:pPr>
+            <w:r/>
+            <w:r>
+              <w:rPr>
+                <w:b w:val="0"/>
+                <w:sz w:val="21"/>
+                <w:rFonts w:eastAsia="宋体" w:ascii="Times New Roman" w:hAnsi="Times New Roman"/>
+              </w:rPr>
+              <w:t>0</w:t>
             </w:r>
           </w:p>
         </w:tc>
@@ -4054,7 +4966,7 @@
       <w:tr>
         <w:tc>
           <w:tcPr>
-            <w:tcW w:type="dxa" w:w="1077"/>
+            <w:tcW w:type="dxa" w:w="1134"/>
             <w:vAlign w:val="center"/>
           </w:tcPr>
           <w:p>
@@ -4074,7 +4986,27 @@
         </w:tc>
         <w:tc>
           <w:tcPr>
-            <w:tcW w:type="dxa" w:w="794"/>
+            <w:tcW w:type="dxa" w:w="1361"/>
+            <w:vAlign w:val="center"/>
+          </w:tcPr>
+          <w:p>
+            <w:pPr>
+              <w:jc w:val="center"/>
+            </w:pPr>
+            <w:r/>
+            <w:r>
+              <w:rPr>
+                <w:b w:val="0"/>
+                <w:sz w:val="21"/>
+                <w:rFonts w:eastAsia="宋体" w:ascii="Times New Roman" w:hAnsi="Times New Roman"/>
+              </w:rPr>
+              <w:t>基线规则</w:t>
+            </w:r>
+          </w:p>
+        </w:tc>
+        <w:tc>
+          <w:tcPr>
+            <w:tcW w:type="dxa" w:w="1020"/>
             <w:vAlign w:val="center"/>
           </w:tcPr>
           <w:p>
@@ -4094,7 +5026,149 @@
         </w:tc>
         <w:tc>
           <w:tcPr>
-            <w:tcW w:type="dxa" w:w="850"/>
+            <w:tcW w:type="dxa" w:w="1020"/>
+            <w:vAlign w:val="center"/>
+          </w:tcPr>
+          <w:p>
+            <w:pPr>
+              <w:jc w:val="center"/>
+            </w:pPr>
+            <w:r/>
+            <w:r>
+              <w:rPr>
+                <w:b w:val="0"/>
+                <w:sz w:val="21"/>
+                <w:rFonts w:eastAsia="宋体" w:ascii="Times New Roman" w:hAnsi="Times New Roman"/>
+              </w:rPr>
+              <w:t>63.00</w:t>
+            </w:r>
+          </w:p>
+        </w:tc>
+        <w:tc>
+          <w:tcPr>
+            <w:tcW w:type="dxa" w:w="1134"/>
+            <w:vAlign w:val="center"/>
+          </w:tcPr>
+          <w:p>
+            <w:pPr>
+              <w:jc w:val="center"/>
+            </w:pPr>
+            <w:r/>
+            <w:r>
+              <w:rPr>
+                <w:b w:val="0"/>
+                <w:sz w:val="21"/>
+                <w:rFonts w:eastAsia="宋体" w:ascii="Times New Roman" w:hAnsi="Times New Roman"/>
+              </w:rPr>
+              <w:t>3240.00</w:t>
+            </w:r>
+          </w:p>
+        </w:tc>
+        <w:tc>
+          <w:tcPr>
+            <w:tcW w:type="dxa" w:w="1020"/>
+            <w:vAlign w:val="center"/>
+          </w:tcPr>
+          <w:p>
+            <w:pPr>
+              <w:jc w:val="center"/>
+            </w:pPr>
+            <w:r/>
+            <w:r>
+              <w:rPr>
+                <w:b w:val="0"/>
+                <w:sz w:val="21"/>
+                <w:rFonts w:eastAsia="宋体" w:ascii="Times New Roman" w:hAnsi="Times New Roman"/>
+              </w:rPr>
+              <w:t>2</w:t>
+            </w:r>
+          </w:p>
+        </w:tc>
+        <w:tc>
+          <w:tcPr>
+            <w:tcW w:type="dxa" w:w="1020"/>
+            <w:vAlign w:val="center"/>
+          </w:tcPr>
+          <w:p>
+            <w:pPr>
+              <w:jc w:val="center"/>
+            </w:pPr>
+            <w:r/>
+            <w:r>
+              <w:rPr>
+                <w:b w:val="0"/>
+                <w:sz w:val="21"/>
+                <w:rFonts w:eastAsia="宋体" w:ascii="Times New Roman" w:hAnsi="Times New Roman"/>
+              </w:rPr>
+              <w:t>1076</w:t>
+            </w:r>
+          </w:p>
+        </w:tc>
+        <w:tc>
+          <w:tcPr>
+            <w:tcW w:type="dxa" w:w="794"/>
+            <w:vAlign w:val="center"/>
+          </w:tcPr>
+          <w:p>
+            <w:pPr>
+              <w:jc w:val="center"/>
+            </w:pPr>
+            <w:r/>
+            <w:r>
+              <w:rPr>
+                <w:b w:val="0"/>
+                <w:sz w:val="21"/>
+                <w:rFonts w:eastAsia="宋体" w:ascii="Times New Roman" w:hAnsi="Times New Roman"/>
+              </w:rPr>
+              <w:t>0</w:t>
+            </w:r>
+          </w:p>
+        </w:tc>
+      </w:tr>
+      <w:tr>
+        <w:tc>
+          <w:tcPr>
+            <w:tcW w:type="dxa" w:w="1134"/>
+            <w:vAlign w:val="center"/>
+          </w:tcPr>
+          <w:p>
+            <w:pPr>
+              <w:jc w:val="center"/>
+            </w:pPr>
+            <w:r/>
+            <w:r>
+              <w:rPr>
+                <w:b w:val="0"/>
+                <w:sz w:val="21"/>
+                <w:rFonts w:eastAsia="宋体" w:ascii="Times New Roman" w:hAnsi="Times New Roman"/>
+              </w:rPr>
+              <w:t>case_03</w:t>
+            </w:r>
+          </w:p>
+        </w:tc>
+        <w:tc>
+          <w:tcPr>
+            <w:tcW w:type="dxa" w:w="1361"/>
+            <w:vAlign w:val="center"/>
+          </w:tcPr>
+          <w:p>
+            <w:pPr>
+              <w:jc w:val="center"/>
+            </w:pPr>
+            <w:r/>
+            <w:r>
+              <w:rPr>
+                <w:b w:val="0"/>
+                <w:sz w:val="21"/>
+                <w:rFonts w:eastAsia="宋体" w:ascii="Times New Roman" w:hAnsi="Times New Roman"/>
+              </w:rPr>
+              <w:t>K-means</w:t>
+            </w:r>
+          </w:p>
+        </w:tc>
+        <w:tc>
+          <w:tcPr>
+            <w:tcW w:type="dxa" w:w="1020"/>
             <w:vAlign w:val="center"/>
           </w:tcPr>
           <w:p>
@@ -4114,7 +5188,149 @@
         </w:tc>
         <w:tc>
           <w:tcPr>
+            <w:tcW w:type="dxa" w:w="1020"/>
+            <w:vAlign w:val="center"/>
+          </w:tcPr>
+          <w:p>
+            <w:pPr>
+              <w:jc w:val="center"/>
+            </w:pPr>
+            <w:r/>
+            <w:r>
+              <w:rPr>
+                <w:b w:val="0"/>
+                <w:sz w:val="21"/>
+                <w:rFonts w:eastAsia="宋体" w:ascii="Times New Roman" w:hAnsi="Times New Roman"/>
+              </w:rPr>
+              <w:t>15.32</w:t>
+            </w:r>
+          </w:p>
+        </w:tc>
+        <w:tc>
+          <w:tcPr>
+            <w:tcW w:type="dxa" w:w="1134"/>
+            <w:vAlign w:val="center"/>
+          </w:tcPr>
+          <w:p>
+            <w:pPr>
+              <w:jc w:val="center"/>
+            </w:pPr>
+            <w:r/>
+            <w:r>
+              <w:rPr>
+                <w:b w:val="0"/>
+                <w:sz w:val="21"/>
+                <w:rFonts w:eastAsia="宋体" w:ascii="Times New Roman" w:hAnsi="Times New Roman"/>
+              </w:rPr>
+              <w:t>1247.00</w:t>
+            </w:r>
+          </w:p>
+        </w:tc>
+        <w:tc>
+          <w:tcPr>
+            <w:tcW w:type="dxa" w:w="1020"/>
+            <w:vAlign w:val="center"/>
+          </w:tcPr>
+          <w:p>
+            <w:pPr>
+              <w:jc w:val="center"/>
+            </w:pPr>
+            <w:r/>
+            <w:r>
+              <w:rPr>
+                <w:b w:val="0"/>
+                <w:sz w:val="21"/>
+                <w:rFonts w:eastAsia="宋体" w:ascii="Times New Roman" w:hAnsi="Times New Roman"/>
+              </w:rPr>
+              <w:t>5</w:t>
+            </w:r>
+          </w:p>
+        </w:tc>
+        <w:tc>
+          <w:tcPr>
+            <w:tcW w:type="dxa" w:w="1020"/>
+            <w:vAlign w:val="center"/>
+          </w:tcPr>
+          <w:p>
+            <w:pPr>
+              <w:jc w:val="center"/>
+            </w:pPr>
+            <w:r/>
+            <w:r>
+              <w:rPr>
+                <w:b w:val="0"/>
+                <w:sz w:val="21"/>
+                <w:rFonts w:eastAsia="宋体" w:ascii="Times New Roman" w:hAnsi="Times New Roman"/>
+              </w:rPr>
+              <w:t>381</w:t>
+            </w:r>
+          </w:p>
+        </w:tc>
+        <w:tc>
+          <w:tcPr>
             <w:tcW w:type="dxa" w:w="794"/>
+            <w:vAlign w:val="center"/>
+          </w:tcPr>
+          <w:p>
+            <w:pPr>
+              <w:jc w:val="center"/>
+            </w:pPr>
+            <w:r/>
+            <w:r>
+              <w:rPr>
+                <w:b w:val="0"/>
+                <w:sz w:val="21"/>
+                <w:rFonts w:eastAsia="宋体" w:ascii="Times New Roman" w:hAnsi="Times New Roman"/>
+              </w:rPr>
+              <w:t>0</w:t>
+            </w:r>
+          </w:p>
+        </w:tc>
+      </w:tr>
+      <w:tr>
+        <w:tc>
+          <w:tcPr>
+            <w:tcW w:type="dxa" w:w="1134"/>
+            <w:vAlign w:val="center"/>
+          </w:tcPr>
+          <w:p>
+            <w:pPr>
+              <w:jc w:val="center"/>
+            </w:pPr>
+            <w:r/>
+            <w:r>
+              <w:rPr>
+                <w:b w:val="0"/>
+                <w:sz w:val="21"/>
+                <w:rFonts w:eastAsia="宋体" w:ascii="Times New Roman" w:hAnsi="Times New Roman"/>
+              </w:rPr>
+              <w:t>case_03</w:t>
+            </w:r>
+          </w:p>
+        </w:tc>
+        <w:tc>
+          <w:tcPr>
+            <w:tcW w:type="dxa" w:w="1361"/>
+            <w:vAlign w:val="center"/>
+          </w:tcPr>
+          <w:p>
+            <w:pPr>
+              <w:jc w:val="center"/>
+            </w:pPr>
+            <w:r/>
+            <w:r>
+              <w:rPr>
+                <w:b w:val="0"/>
+                <w:sz w:val="21"/>
+                <w:rFonts w:eastAsia="宋体" w:ascii="Times New Roman" w:hAnsi="Times New Roman"/>
+              </w:rPr>
+              <w:t>PSO-Hanan</w:t>
+            </w:r>
+          </w:p>
+        </w:tc>
+        <w:tc>
+          <w:tcPr>
+            <w:tcW w:type="dxa" w:w="1020"/>
             <w:vAlign w:val="center"/>
           </w:tcPr>
           <w:p>
@@ -4134,7 +5350,7 @@
         </w:tc>
         <w:tc>
           <w:tcPr>
-            <w:tcW w:type="dxa" w:w="794"/>
+            <w:tcW w:type="dxa" w:w="1020"/>
             <w:vAlign w:val="center"/>
           </w:tcPr>
           <w:p>
@@ -4148,13 +5364,13 @@
                 <w:sz w:val="21"/>
                 <w:rFonts w:eastAsia="宋体" w:ascii="Times New Roman" w:hAnsi="Times New Roman"/>
               </w:rPr>
-              <w:t>63.00</w:t>
+              <w:t>14.98</w:t>
             </w:r>
           </w:p>
         </w:tc>
         <w:tc>
           <w:tcPr>
-            <w:tcW w:type="dxa" w:w="850"/>
+            <w:tcW w:type="dxa" w:w="1134"/>
             <w:vAlign w:val="center"/>
           </w:tcPr>
           <w:p>
@@ -4168,7 +5384,47 @@
                 <w:sz w:val="21"/>
                 <w:rFonts w:eastAsia="宋体" w:ascii="Times New Roman" w:hAnsi="Times New Roman"/>
               </w:rPr>
-              <w:t>15.32</w:t>
+              <w:t>1128.00</w:t>
+            </w:r>
+          </w:p>
+        </w:tc>
+        <w:tc>
+          <w:tcPr>
+            <w:tcW w:type="dxa" w:w="1020"/>
+            <w:vAlign w:val="center"/>
+          </w:tcPr>
+          <w:p>
+            <w:pPr>
+              <w:jc w:val="center"/>
+            </w:pPr>
+            <w:r/>
+            <w:r>
+              <w:rPr>
+                <w:b w:val="0"/>
+                <w:sz w:val="21"/>
+                <w:rFonts w:eastAsia="宋体" w:ascii="Times New Roman" w:hAnsi="Times New Roman"/>
+              </w:rPr>
+              <w:t>3</w:t>
+            </w:r>
+          </w:p>
+        </w:tc>
+        <w:tc>
+          <w:tcPr>
+            <w:tcW w:type="dxa" w:w="1020"/>
+            <w:vAlign w:val="center"/>
+          </w:tcPr>
+          <w:p>
+            <w:pPr>
+              <w:jc w:val="center"/>
+            </w:pPr>
+            <w:r/>
+            <w:r>
+              <w:rPr>
+                <w:b w:val="0"/>
+                <w:sz w:val="21"/>
+                <w:rFonts w:eastAsia="宋体" w:ascii="Times New Roman" w:hAnsi="Times New Roman"/>
+              </w:rPr>
+              <w:t>390</w:t>
             </w:r>
           </w:p>
         </w:tc>
@@ -4188,13 +5444,15 @@
                 <w:sz w:val="21"/>
                 <w:rFonts w:eastAsia="宋体" w:ascii="Times New Roman" w:hAnsi="Times New Roman"/>
               </w:rPr>
-              <w:t>14.98</w:t>
+              <w:t>0</w:t>
             </w:r>
           </w:p>
         </w:tc>
+      </w:tr>
+      <w:tr>
         <w:tc>
           <w:tcPr>
-            <w:tcW w:type="dxa" w:w="907"/>
+            <w:tcW w:type="dxa" w:w="1134"/>
             <w:vAlign w:val="center"/>
           </w:tcPr>
           <w:p>
@@ -4208,13 +5466,13 @@
                 <w:sz w:val="21"/>
                 <w:rFonts w:eastAsia="宋体" w:ascii="Times New Roman" w:hAnsi="Times New Roman"/>
               </w:rPr>
-              <w:t>3240.00</w:t>
+              <w:t>case_03</w:t>
             </w:r>
           </w:p>
         </w:tc>
         <w:tc>
           <w:tcPr>
-            <w:tcW w:type="dxa" w:w="907"/>
+            <w:tcW w:type="dxa" w:w="1361"/>
             <w:vAlign w:val="center"/>
           </w:tcPr>
           <w:p>
@@ -4228,13 +5486,13 @@
                 <w:sz w:val="21"/>
                 <w:rFonts w:eastAsia="宋体" w:ascii="Times New Roman" w:hAnsi="Times New Roman"/>
               </w:rPr>
-              <w:t>1247.00</w:t>
+              <w:t>拥塞重布线</w:t>
             </w:r>
           </w:p>
         </w:tc>
         <w:tc>
           <w:tcPr>
-            <w:tcW w:type="dxa" w:w="850"/>
+            <w:tcW w:type="dxa" w:w="1020"/>
             <w:vAlign w:val="center"/>
           </w:tcPr>
           <w:p>
@@ -4248,13 +5506,13 @@
                 <w:sz w:val="21"/>
                 <w:rFonts w:eastAsia="宋体" w:ascii="Times New Roman" w:hAnsi="Times New Roman"/>
               </w:rPr>
-              <w:t>1128.00</w:t>
+              <w:t>100.00</w:t>
             </w:r>
           </w:p>
         </w:tc>
         <w:tc>
           <w:tcPr>
-            <w:tcW w:type="dxa" w:w="907"/>
+            <w:tcW w:type="dxa" w:w="1020"/>
             <w:vAlign w:val="center"/>
           </w:tcPr>
           <w:p>
@@ -4268,7 +5526,87 @@
                 <w:sz w:val="21"/>
                 <w:rFonts w:eastAsia="宋体" w:ascii="Times New Roman" w:hAnsi="Times New Roman"/>
               </w:rPr>
-              <w:t>0/0</w:t>
+              <w:t>14.98</w:t>
+            </w:r>
+          </w:p>
+        </w:tc>
+        <w:tc>
+          <w:tcPr>
+            <w:tcW w:type="dxa" w:w="1134"/>
+            <w:vAlign w:val="center"/>
+          </w:tcPr>
+          <w:p>
+            <w:pPr>
+              <w:jc w:val="center"/>
+            </w:pPr>
+            <w:r/>
+            <w:r>
+              <w:rPr>
+                <w:b w:val="0"/>
+                <w:sz w:val="21"/>
+                <w:rFonts w:eastAsia="宋体" w:ascii="Times New Roman" w:hAnsi="Times New Roman"/>
+              </w:rPr>
+              <w:t>1210.00</w:t>
+            </w:r>
+          </w:p>
+        </w:tc>
+        <w:tc>
+          <w:tcPr>
+            <w:tcW w:type="dxa" w:w="1020"/>
+            <w:vAlign w:val="center"/>
+          </w:tcPr>
+          <w:p>
+            <w:pPr>
+              <w:jc w:val="center"/>
+            </w:pPr>
+            <w:r/>
+            <w:r>
+              <w:rPr>
+                <w:b w:val="0"/>
+                <w:sz w:val="21"/>
+                <w:rFonts w:eastAsia="宋体" w:ascii="Times New Roman" w:hAnsi="Times New Roman"/>
+              </w:rPr>
+              <w:t>3</w:t>
+            </w:r>
+          </w:p>
+        </w:tc>
+        <w:tc>
+          <w:tcPr>
+            <w:tcW w:type="dxa" w:w="1020"/>
+            <w:vAlign w:val="center"/>
+          </w:tcPr>
+          <w:p>
+            <w:pPr>
+              <w:jc w:val="center"/>
+            </w:pPr>
+            <w:r/>
+            <w:r>
+              <w:rPr>
+                <w:b w:val="0"/>
+                <w:sz w:val="21"/>
+                <w:rFonts w:eastAsia="宋体" w:ascii="Times New Roman" w:hAnsi="Times New Roman"/>
+              </w:rPr>
+              <w:t>416</w:t>
+            </w:r>
+          </w:p>
+        </w:tc>
+        <w:tc>
+          <w:tcPr>
+            <w:tcW w:type="dxa" w:w="794"/>
+            <w:vAlign w:val="center"/>
+          </w:tcPr>
+          <w:p>
+            <w:pPr>
+              <w:jc w:val="center"/>
+            </w:pPr>
+            <w:r/>
+            <w:r>
+              <w:rPr>
+                <w:b w:val="0"/>
+                <w:sz w:val="21"/>
+                <w:rFonts w:eastAsia="宋体" w:ascii="Times New Roman" w:hAnsi="Times New Roman"/>
+              </w:rPr>
+              <w:t>0</w:t>
             </w:r>
           </w:p>
         </w:tc>
@@ -4276,7 +5614,7 @@
       <w:tr>
         <w:tc>
           <w:tcPr>
-            <w:tcW w:type="dxa" w:w="1077"/>
+            <w:tcW w:type="dxa" w:w="1134"/>
             <w:vAlign w:val="center"/>
           </w:tcPr>
           <w:p>
@@ -4296,7 +5634,27 @@
         </w:tc>
         <w:tc>
           <w:tcPr>
-            <w:tcW w:type="dxa" w:w="794"/>
+            <w:tcW w:type="dxa" w:w="1361"/>
+            <w:vAlign w:val="center"/>
+          </w:tcPr>
+          <w:p>
+            <w:pPr>
+              <w:jc w:val="center"/>
+            </w:pPr>
+            <w:r/>
+            <w:r>
+              <w:rPr>
+                <w:b w:val="0"/>
+                <w:sz w:val="21"/>
+                <w:rFonts w:eastAsia="宋体" w:ascii="Times New Roman" w:hAnsi="Times New Roman"/>
+              </w:rPr>
+              <w:t>基线规则</w:t>
+            </w:r>
+          </w:p>
+        </w:tc>
+        <w:tc>
+          <w:tcPr>
+            <w:tcW w:type="dxa" w:w="1020"/>
             <w:vAlign w:val="center"/>
           </w:tcPr>
           <w:p>
@@ -4316,7 +5674,149 @@
         </w:tc>
         <w:tc>
           <w:tcPr>
-            <w:tcW w:type="dxa" w:w="850"/>
+            <w:tcW w:type="dxa" w:w="1020"/>
+            <w:vAlign w:val="center"/>
+          </w:tcPr>
+          <w:p>
+            <w:pPr>
+              <w:jc w:val="center"/>
+            </w:pPr>
+            <w:r/>
+            <w:r>
+              <w:rPr>
+                <w:b w:val="0"/>
+                <w:sz w:val="21"/>
+                <w:rFonts w:eastAsia="宋体" w:ascii="Times New Roman" w:hAnsi="Times New Roman"/>
+              </w:rPr>
+              <w:t>60.64</w:t>
+            </w:r>
+          </w:p>
+        </w:tc>
+        <w:tc>
+          <w:tcPr>
+            <w:tcW w:type="dxa" w:w="1134"/>
+            <w:vAlign w:val="center"/>
+          </w:tcPr>
+          <w:p>
+            <w:pPr>
+              <w:jc w:val="center"/>
+            </w:pPr>
+            <w:r/>
+            <w:r>
+              <w:rPr>
+                <w:b w:val="0"/>
+                <w:sz w:val="21"/>
+                <w:rFonts w:eastAsia="宋体" w:ascii="Times New Roman" w:hAnsi="Times New Roman"/>
+              </w:rPr>
+              <w:t>2249.00</w:t>
+            </w:r>
+          </w:p>
+        </w:tc>
+        <w:tc>
+          <w:tcPr>
+            <w:tcW w:type="dxa" w:w="1020"/>
+            <w:vAlign w:val="center"/>
+          </w:tcPr>
+          <w:p>
+            <w:pPr>
+              <w:jc w:val="center"/>
+            </w:pPr>
+            <w:r/>
+            <w:r>
+              <w:rPr>
+                <w:b w:val="0"/>
+                <w:sz w:val="21"/>
+                <w:rFonts w:eastAsia="宋体" w:ascii="Times New Roman" w:hAnsi="Times New Roman"/>
+              </w:rPr>
+              <w:t>7</w:t>
+            </w:r>
+          </w:p>
+        </w:tc>
+        <w:tc>
+          <w:tcPr>
+            <w:tcW w:type="dxa" w:w="1020"/>
+            <w:vAlign w:val="center"/>
+          </w:tcPr>
+          <w:p>
+            <w:pPr>
+              <w:jc w:val="center"/>
+            </w:pPr>
+            <w:r/>
+            <w:r>
+              <w:rPr>
+                <w:b w:val="0"/>
+                <w:sz w:val="21"/>
+                <w:rFonts w:eastAsia="宋体" w:ascii="Times New Roman" w:hAnsi="Times New Roman"/>
+              </w:rPr>
+              <w:t>531</w:t>
+            </w:r>
+          </w:p>
+        </w:tc>
+        <w:tc>
+          <w:tcPr>
+            <w:tcW w:type="dxa" w:w="794"/>
+            <w:vAlign w:val="center"/>
+          </w:tcPr>
+          <w:p>
+            <w:pPr>
+              <w:jc w:val="center"/>
+            </w:pPr>
+            <w:r/>
+            <w:r>
+              <w:rPr>
+                <w:b w:val="0"/>
+                <w:sz w:val="21"/>
+                <w:rFonts w:eastAsia="宋体" w:ascii="Times New Roman" w:hAnsi="Times New Roman"/>
+              </w:rPr>
+              <w:t>15</w:t>
+            </w:r>
+          </w:p>
+        </w:tc>
+      </w:tr>
+      <w:tr>
+        <w:tc>
+          <w:tcPr>
+            <w:tcW w:type="dxa" w:w="1134"/>
+            <w:vAlign w:val="center"/>
+          </w:tcPr>
+          <w:p>
+            <w:pPr>
+              <w:jc w:val="center"/>
+            </w:pPr>
+            <w:r/>
+            <w:r>
+              <w:rPr>
+                <w:b w:val="0"/>
+                <w:sz w:val="21"/>
+                <w:rFonts w:eastAsia="宋体" w:ascii="Times New Roman" w:hAnsi="Times New Roman"/>
+              </w:rPr>
+              <w:t>case_04</w:t>
+            </w:r>
+          </w:p>
+        </w:tc>
+        <w:tc>
+          <w:tcPr>
+            <w:tcW w:type="dxa" w:w="1361"/>
+            <w:vAlign w:val="center"/>
+          </w:tcPr>
+          <w:p>
+            <w:pPr>
+              <w:jc w:val="center"/>
+            </w:pPr>
+            <w:r/>
+            <w:r>
+              <w:rPr>
+                <w:b w:val="0"/>
+                <w:sz w:val="21"/>
+                <w:rFonts w:eastAsia="宋体" w:ascii="Times New Roman" w:hAnsi="Times New Roman"/>
+              </w:rPr>
+              <w:t>K-means</w:t>
+            </w:r>
+          </w:p>
+        </w:tc>
+        <w:tc>
+          <w:tcPr>
+            <w:tcW w:type="dxa" w:w="1020"/>
             <w:vAlign w:val="center"/>
           </w:tcPr>
           <w:p>
@@ -4336,7 +5836,149 @@
         </w:tc>
         <w:tc>
           <w:tcPr>
+            <w:tcW w:type="dxa" w:w="1020"/>
+            <w:vAlign w:val="center"/>
+          </w:tcPr>
+          <w:p>
+            <w:pPr>
+              <w:jc w:val="center"/>
+            </w:pPr>
+            <w:r/>
+            <w:r>
+              <w:rPr>
+                <w:b w:val="0"/>
+                <w:sz w:val="21"/>
+                <w:rFonts w:eastAsia="宋体" w:ascii="Times New Roman" w:hAnsi="Times New Roman"/>
+              </w:rPr>
+              <w:t>14.84</w:t>
+            </w:r>
+          </w:p>
+        </w:tc>
+        <w:tc>
+          <w:tcPr>
+            <w:tcW w:type="dxa" w:w="1134"/>
+            <w:vAlign w:val="center"/>
+          </w:tcPr>
+          <w:p>
+            <w:pPr>
+              <w:jc w:val="center"/>
+            </w:pPr>
+            <w:r/>
+            <w:r>
+              <w:rPr>
+                <w:b w:val="0"/>
+                <w:sz w:val="21"/>
+                <w:rFonts w:eastAsia="宋体" w:ascii="Times New Roman" w:hAnsi="Times New Roman"/>
+              </w:rPr>
+              <w:t>972.00</w:t>
+            </w:r>
+          </w:p>
+        </w:tc>
+        <w:tc>
+          <w:tcPr>
+            <w:tcW w:type="dxa" w:w="1020"/>
+            <w:vAlign w:val="center"/>
+          </w:tcPr>
+          <w:p>
+            <w:pPr>
+              <w:jc w:val="center"/>
+            </w:pPr>
+            <w:r/>
+            <w:r>
+              <w:rPr>
+                <w:b w:val="0"/>
+                <w:sz w:val="21"/>
+                <w:rFonts w:eastAsia="宋体" w:ascii="Times New Roman" w:hAnsi="Times New Roman"/>
+              </w:rPr>
+              <w:t>4</w:t>
+            </w:r>
+          </w:p>
+        </w:tc>
+        <w:tc>
+          <w:tcPr>
+            <w:tcW w:type="dxa" w:w="1020"/>
+            <w:vAlign w:val="center"/>
+          </w:tcPr>
+          <w:p>
+            <w:pPr>
+              <w:jc w:val="center"/>
+            </w:pPr>
+            <w:r/>
+            <w:r>
+              <w:rPr>
+                <w:b w:val="0"/>
+                <w:sz w:val="21"/>
+                <w:rFonts w:eastAsia="宋体" w:ascii="Times New Roman" w:hAnsi="Times New Roman"/>
+              </w:rPr>
+              <w:t>318</w:t>
+            </w:r>
+          </w:p>
+        </w:tc>
+        <w:tc>
+          <w:tcPr>
             <w:tcW w:type="dxa" w:w="794"/>
+            <w:vAlign w:val="center"/>
+          </w:tcPr>
+          <w:p>
+            <w:pPr>
+              <w:jc w:val="center"/>
+            </w:pPr>
+            <w:r/>
+            <w:r>
+              <w:rPr>
+                <w:b w:val="0"/>
+                <w:sz w:val="21"/>
+                <w:rFonts w:eastAsia="宋体" w:ascii="Times New Roman" w:hAnsi="Times New Roman"/>
+              </w:rPr>
+              <w:t>0</w:t>
+            </w:r>
+          </w:p>
+        </w:tc>
+      </w:tr>
+      <w:tr>
+        <w:tc>
+          <w:tcPr>
+            <w:tcW w:type="dxa" w:w="1134"/>
+            <w:vAlign w:val="center"/>
+          </w:tcPr>
+          <w:p>
+            <w:pPr>
+              <w:jc w:val="center"/>
+            </w:pPr>
+            <w:r/>
+            <w:r>
+              <w:rPr>
+                <w:b w:val="0"/>
+                <w:sz w:val="21"/>
+                <w:rFonts w:eastAsia="宋体" w:ascii="Times New Roman" w:hAnsi="Times New Roman"/>
+              </w:rPr>
+              <w:t>case_04</w:t>
+            </w:r>
+          </w:p>
+        </w:tc>
+        <w:tc>
+          <w:tcPr>
+            <w:tcW w:type="dxa" w:w="1361"/>
+            <w:vAlign w:val="center"/>
+          </w:tcPr>
+          <w:p>
+            <w:pPr>
+              <w:jc w:val="center"/>
+            </w:pPr>
+            <w:r/>
+            <w:r>
+              <w:rPr>
+                <w:b w:val="0"/>
+                <w:sz w:val="21"/>
+                <w:rFonts w:eastAsia="宋体" w:ascii="Times New Roman" w:hAnsi="Times New Roman"/>
+              </w:rPr>
+              <w:t>PSO-Hanan</w:t>
+            </w:r>
+          </w:p>
+        </w:tc>
+        <w:tc>
+          <w:tcPr>
+            <w:tcW w:type="dxa" w:w="1020"/>
             <w:vAlign w:val="center"/>
           </w:tcPr>
           <w:p>
@@ -4356,7 +5998,7 @@
         </w:tc>
         <w:tc>
           <w:tcPr>
-            <w:tcW w:type="dxa" w:w="794"/>
+            <w:tcW w:type="dxa" w:w="1020"/>
             <w:vAlign w:val="center"/>
           </w:tcPr>
           <w:p>
@@ -4370,13 +6012,13 @@
                 <w:sz w:val="21"/>
                 <w:rFonts w:eastAsia="宋体" w:ascii="Times New Roman" w:hAnsi="Times New Roman"/>
               </w:rPr>
-              <w:t>60.64</w:t>
+              <w:t>11.72</w:t>
             </w:r>
           </w:p>
         </w:tc>
         <w:tc>
           <w:tcPr>
-            <w:tcW w:type="dxa" w:w="850"/>
+            <w:tcW w:type="dxa" w:w="1134"/>
             <w:vAlign w:val="center"/>
           </w:tcPr>
           <w:p>
@@ -4390,7 +6032,47 @@
                 <w:sz w:val="21"/>
                 <w:rFonts w:eastAsia="宋体" w:ascii="Times New Roman" w:hAnsi="Times New Roman"/>
               </w:rPr>
-              <w:t>14.84</w:t>
+              <w:t>858.00</w:t>
+            </w:r>
+          </w:p>
+        </w:tc>
+        <w:tc>
+          <w:tcPr>
+            <w:tcW w:type="dxa" w:w="1020"/>
+            <w:vAlign w:val="center"/>
+          </w:tcPr>
+          <w:p>
+            <w:pPr>
+              <w:jc w:val="center"/>
+            </w:pPr>
+            <w:r/>
+            <w:r>
+              <w:rPr>
+                <w:b w:val="0"/>
+                <w:sz w:val="21"/>
+                <w:rFonts w:eastAsia="宋体" w:ascii="Times New Roman" w:hAnsi="Times New Roman"/>
+              </w:rPr>
+              <w:t>3</w:t>
+            </w:r>
+          </w:p>
+        </w:tc>
+        <w:tc>
+          <w:tcPr>
+            <w:tcW w:type="dxa" w:w="1020"/>
+            <w:vAlign w:val="center"/>
+          </w:tcPr>
+          <w:p>
+            <w:pPr>
+              <w:jc w:val="center"/>
+            </w:pPr>
+            <w:r/>
+            <w:r>
+              <w:rPr>
+                <w:b w:val="0"/>
+                <w:sz w:val="21"/>
+                <w:rFonts w:eastAsia="宋体" w:ascii="Times New Roman" w:hAnsi="Times New Roman"/>
+              </w:rPr>
+              <w:t>243</w:t>
             </w:r>
           </w:p>
         </w:tc>
@@ -4410,13 +6092,15 @@
                 <w:sz w:val="21"/>
                 <w:rFonts w:eastAsia="宋体" w:ascii="Times New Roman" w:hAnsi="Times New Roman"/>
               </w:rPr>
-              <w:t>11.72</w:t>
+              <w:t>0</w:t>
             </w:r>
           </w:p>
         </w:tc>
+      </w:tr>
+      <w:tr>
         <w:tc>
           <w:tcPr>
-            <w:tcW w:type="dxa" w:w="907"/>
+            <w:tcW w:type="dxa" w:w="1134"/>
             <w:vAlign w:val="center"/>
           </w:tcPr>
           <w:p>
@@ -4430,13 +6114,13 @@
                 <w:sz w:val="21"/>
                 <w:rFonts w:eastAsia="宋体" w:ascii="Times New Roman" w:hAnsi="Times New Roman"/>
               </w:rPr>
-              <w:t>2249.00</w:t>
+              <w:t>case_04</w:t>
             </w:r>
           </w:p>
         </w:tc>
         <w:tc>
           <w:tcPr>
-            <w:tcW w:type="dxa" w:w="907"/>
+            <w:tcW w:type="dxa" w:w="1361"/>
             <w:vAlign w:val="center"/>
           </w:tcPr>
           <w:p>
@@ -4450,13 +6134,13 @@
                 <w:sz w:val="21"/>
                 <w:rFonts w:eastAsia="宋体" w:ascii="Times New Roman" w:hAnsi="Times New Roman"/>
               </w:rPr>
-              <w:t>972.00</w:t>
+              <w:t>拥塞重布线</w:t>
             </w:r>
           </w:p>
         </w:tc>
         <w:tc>
           <w:tcPr>
-            <w:tcW w:type="dxa" w:w="850"/>
+            <w:tcW w:type="dxa" w:w="1020"/>
             <w:vAlign w:val="center"/>
           </w:tcPr>
           <w:p>
@@ -4470,13 +6154,13 @@
                 <w:sz w:val="21"/>
                 <w:rFonts w:eastAsia="宋体" w:ascii="Times New Roman" w:hAnsi="Times New Roman"/>
               </w:rPr>
-              <w:t>858.00</w:t>
+              <w:t>100.00</w:t>
             </w:r>
           </w:p>
         </w:tc>
         <w:tc>
           <w:tcPr>
-            <w:tcW w:type="dxa" w:w="907"/>
+            <w:tcW w:type="dxa" w:w="1020"/>
             <w:vAlign w:val="center"/>
           </w:tcPr>
           <w:p>
@@ -4490,7 +6174,87 @@
                 <w:sz w:val="21"/>
                 <w:rFonts w:eastAsia="宋体" w:ascii="Times New Roman" w:hAnsi="Times New Roman"/>
               </w:rPr>
-              <w:t>15/0</w:t>
+              <w:t>11.72</w:t>
+            </w:r>
+          </w:p>
+        </w:tc>
+        <w:tc>
+          <w:tcPr>
+            <w:tcW w:type="dxa" w:w="1134"/>
+            <w:vAlign w:val="center"/>
+          </w:tcPr>
+          <w:p>
+            <w:pPr>
+              <w:jc w:val="center"/>
+            </w:pPr>
+            <w:r/>
+            <w:r>
+              <w:rPr>
+                <w:b w:val="0"/>
+                <w:sz w:val="21"/>
+                <w:rFonts w:eastAsia="宋体" w:ascii="Times New Roman" w:hAnsi="Times New Roman"/>
+              </w:rPr>
+              <w:t>908.00</w:t>
+            </w:r>
+          </w:p>
+        </w:tc>
+        <w:tc>
+          <w:tcPr>
+            <w:tcW w:type="dxa" w:w="1020"/>
+            <w:vAlign w:val="center"/>
+          </w:tcPr>
+          <w:p>
+            <w:pPr>
+              <w:jc w:val="center"/>
+            </w:pPr>
+            <w:r/>
+            <w:r>
+              <w:rPr>
+                <w:b w:val="0"/>
+                <w:sz w:val="21"/>
+                <w:rFonts w:eastAsia="宋体" w:ascii="Times New Roman" w:hAnsi="Times New Roman"/>
+              </w:rPr>
+              <w:t>3</w:t>
+            </w:r>
+          </w:p>
+        </w:tc>
+        <w:tc>
+          <w:tcPr>
+            <w:tcW w:type="dxa" w:w="1020"/>
+            <w:vAlign w:val="center"/>
+          </w:tcPr>
+          <w:p>
+            <w:pPr>
+              <w:jc w:val="center"/>
+            </w:pPr>
+            <w:r/>
+            <w:r>
+              <w:rPr>
+                <w:b w:val="0"/>
+                <w:sz w:val="21"/>
+                <w:rFonts w:eastAsia="宋体" w:ascii="Times New Roman" w:hAnsi="Times New Roman"/>
+              </w:rPr>
+              <w:t>244</w:t>
+            </w:r>
+          </w:p>
+        </w:tc>
+        <w:tc>
+          <w:tcPr>
+            <w:tcW w:type="dxa" w:w="794"/>
+            <w:vAlign w:val="center"/>
+          </w:tcPr>
+          <w:p>
+            <w:pPr>
+              <w:jc w:val="center"/>
+            </w:pPr>
+            <w:r/>
+            <w:r>
+              <w:rPr>
+                <w:b w:val="0"/>
+                <w:sz w:val="21"/>
+                <w:rFonts w:eastAsia="宋体" w:ascii="Times New Roman" w:hAnsi="Times New Roman"/>
+              </w:rPr>
+              <w:t>0</w:t>
             </w:r>
           </w:p>
         </w:tc>
@@ -4498,7 +6262,7 @@
       <w:tr>
         <w:tc>
           <w:tcPr>
-            <w:tcW w:type="dxa" w:w="1077"/>
+            <w:tcW w:type="dxa" w:w="1134"/>
             <w:vAlign w:val="center"/>
           </w:tcPr>
           <w:p>
@@ -4518,7 +6282,27 @@
         </w:tc>
         <w:tc>
           <w:tcPr>
-            <w:tcW w:type="dxa" w:w="794"/>
+            <w:tcW w:type="dxa" w:w="1361"/>
+            <w:vAlign w:val="center"/>
+          </w:tcPr>
+          <w:p>
+            <w:pPr>
+              <w:jc w:val="center"/>
+            </w:pPr>
+            <w:r/>
+            <w:r>
+              <w:rPr>
+                <w:b w:val="0"/>
+                <w:sz w:val="21"/>
+                <w:rFonts w:eastAsia="宋体" w:ascii="Times New Roman" w:hAnsi="Times New Roman"/>
+              </w:rPr>
+              <w:t>基线规则</w:t>
+            </w:r>
+          </w:p>
+        </w:tc>
+        <w:tc>
+          <w:tcPr>
+            <w:tcW w:type="dxa" w:w="1020"/>
             <w:vAlign w:val="center"/>
           </w:tcPr>
           <w:p>
@@ -4538,7 +6322,149 @@
         </w:tc>
         <w:tc>
           <w:tcPr>
-            <w:tcW w:type="dxa" w:w="850"/>
+            <w:tcW w:type="dxa" w:w="1020"/>
+            <w:vAlign w:val="center"/>
+          </w:tcPr>
+          <w:p>
+            <w:pPr>
+              <w:jc w:val="center"/>
+            </w:pPr>
+            <w:r/>
+            <w:r>
+              <w:rPr>
+                <w:b w:val="0"/>
+                <w:sz w:val="21"/>
+                <w:rFonts w:eastAsia="宋体" w:ascii="Times New Roman" w:hAnsi="Times New Roman"/>
+              </w:rPr>
+              <w:t>65.81</w:t>
+            </w:r>
+          </w:p>
+        </w:tc>
+        <w:tc>
+          <w:tcPr>
+            <w:tcW w:type="dxa" w:w="1134"/>
+            <w:vAlign w:val="center"/>
+          </w:tcPr>
+          <w:p>
+            <w:pPr>
+              <w:jc w:val="center"/>
+            </w:pPr>
+            <w:r/>
+            <w:r>
+              <w:rPr>
+                <w:b w:val="0"/>
+                <w:sz w:val="21"/>
+                <w:rFonts w:eastAsia="宋体" w:ascii="Times New Roman" w:hAnsi="Times New Roman"/>
+              </w:rPr>
+              <w:t>1827.00</w:t>
+            </w:r>
+          </w:p>
+        </w:tc>
+        <w:tc>
+          <w:tcPr>
+            <w:tcW w:type="dxa" w:w="1020"/>
+            <w:vAlign w:val="center"/>
+          </w:tcPr>
+          <w:p>
+            <w:pPr>
+              <w:jc w:val="center"/>
+            </w:pPr>
+            <w:r/>
+            <w:r>
+              <w:rPr>
+                <w:b w:val="0"/>
+                <w:sz w:val="21"/>
+                <w:rFonts w:eastAsia="宋体" w:ascii="Times New Roman" w:hAnsi="Times New Roman"/>
+              </w:rPr>
+              <w:t>6</w:t>
+            </w:r>
+          </w:p>
+        </w:tc>
+        <w:tc>
+          <w:tcPr>
+            <w:tcW w:type="dxa" w:w="1020"/>
+            <w:vAlign w:val="center"/>
+          </w:tcPr>
+          <w:p>
+            <w:pPr>
+              <w:jc w:val="center"/>
+            </w:pPr>
+            <w:r/>
+            <w:r>
+              <w:rPr>
+                <w:b w:val="0"/>
+                <w:sz w:val="21"/>
+                <w:rFonts w:eastAsia="宋体" w:ascii="Times New Roman" w:hAnsi="Times New Roman"/>
+              </w:rPr>
+              <w:t>587</w:t>
+            </w:r>
+          </w:p>
+        </w:tc>
+        <w:tc>
+          <w:tcPr>
+            <w:tcW w:type="dxa" w:w="794"/>
+            <w:vAlign w:val="center"/>
+          </w:tcPr>
+          <w:p>
+            <w:pPr>
+              <w:jc w:val="center"/>
+            </w:pPr>
+            <w:r/>
+            <w:r>
+              <w:rPr>
+                <w:b w:val="0"/>
+                <w:sz w:val="21"/>
+                <w:rFonts w:eastAsia="宋体" w:ascii="Times New Roman" w:hAnsi="Times New Roman"/>
+              </w:rPr>
+              <w:t>11</w:t>
+            </w:r>
+          </w:p>
+        </w:tc>
+      </w:tr>
+      <w:tr>
+        <w:tc>
+          <w:tcPr>
+            <w:tcW w:type="dxa" w:w="1134"/>
+            <w:vAlign w:val="center"/>
+          </w:tcPr>
+          <w:p>
+            <w:pPr>
+              <w:jc w:val="center"/>
+            </w:pPr>
+            <w:r/>
+            <w:r>
+              <w:rPr>
+                <w:b w:val="0"/>
+                <w:sz w:val="21"/>
+                <w:rFonts w:eastAsia="宋体" w:ascii="Times New Roman" w:hAnsi="Times New Roman"/>
+              </w:rPr>
+              <w:t>case_05</w:t>
+            </w:r>
+          </w:p>
+        </w:tc>
+        <w:tc>
+          <w:tcPr>
+            <w:tcW w:type="dxa" w:w="1361"/>
+            <w:vAlign w:val="center"/>
+          </w:tcPr>
+          <w:p>
+            <w:pPr>
+              <w:jc w:val="center"/>
+            </w:pPr>
+            <w:r/>
+            <w:r>
+              <w:rPr>
+                <w:b w:val="0"/>
+                <w:sz w:val="21"/>
+                <w:rFonts w:eastAsia="宋体" w:ascii="Times New Roman" w:hAnsi="Times New Roman"/>
+              </w:rPr>
+              <w:t>K-means</w:t>
+            </w:r>
+          </w:p>
+        </w:tc>
+        <w:tc>
+          <w:tcPr>
+            <w:tcW w:type="dxa" w:w="1020"/>
             <w:vAlign w:val="center"/>
           </w:tcPr>
           <w:p>
@@ -4558,7 +6484,149 @@
         </w:tc>
         <w:tc>
           <w:tcPr>
+            <w:tcW w:type="dxa" w:w="1020"/>
+            <w:vAlign w:val="center"/>
+          </w:tcPr>
+          <w:p>
+            <w:pPr>
+              <w:jc w:val="center"/>
+            </w:pPr>
+            <w:r/>
+            <w:r>
+              <w:rPr>
+                <w:b w:val="0"/>
+                <w:sz w:val="21"/>
+                <w:rFonts w:eastAsia="宋体" w:ascii="Times New Roman" w:hAnsi="Times New Roman"/>
+              </w:rPr>
+              <w:t>26.12</w:t>
+            </w:r>
+          </w:p>
+        </w:tc>
+        <w:tc>
+          <w:tcPr>
+            <w:tcW w:type="dxa" w:w="1134"/>
+            <w:vAlign w:val="center"/>
+          </w:tcPr>
+          <w:p>
+            <w:pPr>
+              <w:jc w:val="center"/>
+            </w:pPr>
+            <w:r/>
+            <w:r>
+              <w:rPr>
+                <w:b w:val="0"/>
+                <w:sz w:val="21"/>
+                <w:rFonts w:eastAsia="宋体" w:ascii="Times New Roman" w:hAnsi="Times New Roman"/>
+              </w:rPr>
+              <w:t>1059.00</w:t>
+            </w:r>
+          </w:p>
+        </w:tc>
+        <w:tc>
+          <w:tcPr>
+            <w:tcW w:type="dxa" w:w="1020"/>
+            <w:vAlign w:val="center"/>
+          </w:tcPr>
+          <w:p>
+            <w:pPr>
+              <w:jc w:val="center"/>
+            </w:pPr>
+            <w:r/>
+            <w:r>
+              <w:rPr>
+                <w:b w:val="0"/>
+                <w:sz w:val="21"/>
+                <w:rFonts w:eastAsia="宋体" w:ascii="Times New Roman" w:hAnsi="Times New Roman"/>
+              </w:rPr>
+              <w:t>5</w:t>
+            </w:r>
+          </w:p>
+        </w:tc>
+        <w:tc>
+          <w:tcPr>
+            <w:tcW w:type="dxa" w:w="1020"/>
+            <w:vAlign w:val="center"/>
+          </w:tcPr>
+          <w:p>
+            <w:pPr>
+              <w:jc w:val="center"/>
+            </w:pPr>
+            <w:r/>
+            <w:r>
+              <w:rPr>
+                <w:b w:val="0"/>
+                <w:sz w:val="21"/>
+                <w:rFonts w:eastAsia="宋体" w:ascii="Times New Roman" w:hAnsi="Times New Roman"/>
+              </w:rPr>
+              <w:t>364</w:t>
+            </w:r>
+          </w:p>
+        </w:tc>
+        <w:tc>
+          <w:tcPr>
             <w:tcW w:type="dxa" w:w="794"/>
+            <w:vAlign w:val="center"/>
+          </w:tcPr>
+          <w:p>
+            <w:pPr>
+              <w:jc w:val="center"/>
+            </w:pPr>
+            <w:r/>
+            <w:r>
+              <w:rPr>
+                <w:b w:val="0"/>
+                <w:sz w:val="21"/>
+                <w:rFonts w:eastAsia="宋体" w:ascii="Times New Roman" w:hAnsi="Times New Roman"/>
+              </w:rPr>
+              <w:t>0</w:t>
+            </w:r>
+          </w:p>
+        </w:tc>
+      </w:tr>
+      <w:tr>
+        <w:tc>
+          <w:tcPr>
+            <w:tcW w:type="dxa" w:w="1134"/>
+            <w:vAlign w:val="center"/>
+          </w:tcPr>
+          <w:p>
+            <w:pPr>
+              <w:jc w:val="center"/>
+            </w:pPr>
+            <w:r/>
+            <w:r>
+              <w:rPr>
+                <w:b w:val="0"/>
+                <w:sz w:val="21"/>
+                <w:rFonts w:eastAsia="宋体" w:ascii="Times New Roman" w:hAnsi="Times New Roman"/>
+              </w:rPr>
+              <w:t>case_05</w:t>
+            </w:r>
+          </w:p>
+        </w:tc>
+        <w:tc>
+          <w:tcPr>
+            <w:tcW w:type="dxa" w:w="1361"/>
+            <w:vAlign w:val="center"/>
+          </w:tcPr>
+          <w:p>
+            <w:pPr>
+              <w:jc w:val="center"/>
+            </w:pPr>
+            <w:r/>
+            <w:r>
+              <w:rPr>
+                <w:b w:val="0"/>
+                <w:sz w:val="21"/>
+                <w:rFonts w:eastAsia="宋体" w:ascii="Times New Roman" w:hAnsi="Times New Roman"/>
+              </w:rPr>
+              <w:t>PSO-Hanan</w:t>
+            </w:r>
+          </w:p>
+        </w:tc>
+        <w:tc>
+          <w:tcPr>
+            <w:tcW w:type="dxa" w:w="1020"/>
             <w:vAlign w:val="center"/>
           </w:tcPr>
           <w:p>
@@ -4578,7 +6646,7 @@
         </w:tc>
         <w:tc>
           <w:tcPr>
-            <w:tcW w:type="dxa" w:w="794"/>
+            <w:tcW w:type="dxa" w:w="1020"/>
             <w:vAlign w:val="center"/>
           </w:tcPr>
           <w:p>
@@ -4592,13 +6660,13 @@
                 <w:sz w:val="21"/>
                 <w:rFonts w:eastAsia="宋体" w:ascii="Times New Roman" w:hAnsi="Times New Roman"/>
               </w:rPr>
-              <w:t>65.81</w:t>
+              <w:t>24.39</w:t>
             </w:r>
           </w:p>
         </w:tc>
         <w:tc>
           <w:tcPr>
-            <w:tcW w:type="dxa" w:w="850"/>
+            <w:tcW w:type="dxa" w:w="1134"/>
             <w:vAlign w:val="center"/>
           </w:tcPr>
           <w:p>
@@ -4612,7 +6680,47 @@
                 <w:sz w:val="21"/>
                 <w:rFonts w:eastAsia="宋体" w:ascii="Times New Roman" w:hAnsi="Times New Roman"/>
               </w:rPr>
-              <w:t>26.12</w:t>
+              <w:t>951.00</w:t>
+            </w:r>
+          </w:p>
+        </w:tc>
+        <w:tc>
+          <w:tcPr>
+            <w:tcW w:type="dxa" w:w="1020"/>
+            <w:vAlign w:val="center"/>
+          </w:tcPr>
+          <w:p>
+            <w:pPr>
+              <w:jc w:val="center"/>
+            </w:pPr>
+            <w:r/>
+            <w:r>
+              <w:rPr>
+                <w:b w:val="0"/>
+                <w:sz w:val="21"/>
+                <w:rFonts w:eastAsia="宋体" w:ascii="Times New Roman" w:hAnsi="Times New Roman"/>
+              </w:rPr>
+              <w:t>4</w:t>
+            </w:r>
+          </w:p>
+        </w:tc>
+        <w:tc>
+          <w:tcPr>
+            <w:tcW w:type="dxa" w:w="1020"/>
+            <w:vAlign w:val="center"/>
+          </w:tcPr>
+          <w:p>
+            <w:pPr>
+              <w:jc w:val="center"/>
+            </w:pPr>
+            <w:r/>
+            <w:r>
+              <w:rPr>
+                <w:b w:val="0"/>
+                <w:sz w:val="21"/>
+                <w:rFonts w:eastAsia="宋体" w:ascii="Times New Roman" w:hAnsi="Times New Roman"/>
+              </w:rPr>
+              <w:t>304</w:t>
             </w:r>
           </w:p>
         </w:tc>
@@ -4632,13 +6740,15 @@
                 <w:sz w:val="21"/>
                 <w:rFonts w:eastAsia="宋体" w:ascii="Times New Roman" w:hAnsi="Times New Roman"/>
               </w:rPr>
-              <w:t>24.39</w:t>
+              <w:t>0</w:t>
             </w:r>
           </w:p>
         </w:tc>
+      </w:tr>
+      <w:tr>
         <w:tc>
           <w:tcPr>
-            <w:tcW w:type="dxa" w:w="907"/>
+            <w:tcW w:type="dxa" w:w="1134"/>
             <w:vAlign w:val="center"/>
           </w:tcPr>
           <w:p>
@@ -4652,13 +6762,13 @@
                 <w:sz w:val="21"/>
                 <w:rFonts w:eastAsia="宋体" w:ascii="Times New Roman" w:hAnsi="Times New Roman"/>
               </w:rPr>
-              <w:t>1827.00</w:t>
+              <w:t>case_05</w:t>
             </w:r>
           </w:p>
         </w:tc>
         <w:tc>
           <w:tcPr>
-            <w:tcW w:type="dxa" w:w="907"/>
+            <w:tcW w:type="dxa" w:w="1361"/>
             <w:vAlign w:val="center"/>
           </w:tcPr>
           <w:p>
@@ -4672,13 +6782,13 @@
                 <w:sz w:val="21"/>
                 <w:rFonts w:eastAsia="宋体" w:ascii="Times New Roman" w:hAnsi="Times New Roman"/>
               </w:rPr>
-              <w:t>1059.00</w:t>
+              <w:t>拥塞重布线</w:t>
             </w:r>
           </w:p>
         </w:tc>
         <w:tc>
           <w:tcPr>
-            <w:tcW w:type="dxa" w:w="850"/>
+            <w:tcW w:type="dxa" w:w="1020"/>
             <w:vAlign w:val="center"/>
           </w:tcPr>
           <w:p>
@@ -4692,13 +6802,13 @@
                 <w:sz w:val="21"/>
                 <w:rFonts w:eastAsia="宋体" w:ascii="Times New Roman" w:hAnsi="Times New Roman"/>
               </w:rPr>
-              <w:t>951.00</w:t>
+              <w:t>100.00</w:t>
             </w:r>
           </w:p>
         </w:tc>
         <w:tc>
           <w:tcPr>
-            <w:tcW w:type="dxa" w:w="907"/>
+            <w:tcW w:type="dxa" w:w="1020"/>
             <w:vAlign w:val="center"/>
           </w:tcPr>
           <w:p>
@@ -4712,7 +6822,87 @@
                 <w:sz w:val="21"/>
                 <w:rFonts w:eastAsia="宋体" w:ascii="Times New Roman" w:hAnsi="Times New Roman"/>
               </w:rPr>
-              <w:t>11/0</w:t>
+              <w:t>24.39</w:t>
+            </w:r>
+          </w:p>
+        </w:tc>
+        <w:tc>
+          <w:tcPr>
+            <w:tcW w:type="dxa" w:w="1134"/>
+            <w:vAlign w:val="center"/>
+          </w:tcPr>
+          <w:p>
+            <w:pPr>
+              <w:jc w:val="center"/>
+            </w:pPr>
+            <w:r/>
+            <w:r>
+              <w:rPr>
+                <w:b w:val="0"/>
+                <w:sz w:val="21"/>
+                <w:rFonts w:eastAsia="宋体" w:ascii="Times New Roman" w:hAnsi="Times New Roman"/>
+              </w:rPr>
+              <w:t>985.00</w:t>
+            </w:r>
+          </w:p>
+        </w:tc>
+        <w:tc>
+          <w:tcPr>
+            <w:tcW w:type="dxa" w:w="1020"/>
+            <w:vAlign w:val="center"/>
+          </w:tcPr>
+          <w:p>
+            <w:pPr>
+              <w:jc w:val="center"/>
+            </w:pPr>
+            <w:r/>
+            <w:r>
+              <w:rPr>
+                <w:b w:val="0"/>
+                <w:sz w:val="21"/>
+                <w:rFonts w:eastAsia="宋体" w:ascii="Times New Roman" w:hAnsi="Times New Roman"/>
+              </w:rPr>
+              <w:t>3</w:t>
+            </w:r>
+          </w:p>
+        </w:tc>
+        <w:tc>
+          <w:tcPr>
+            <w:tcW w:type="dxa" w:w="1020"/>
+            <w:vAlign w:val="center"/>
+          </w:tcPr>
+          <w:p>
+            <w:pPr>
+              <w:jc w:val="center"/>
+            </w:pPr>
+            <w:r/>
+            <w:r>
+              <w:rPr>
+                <w:b w:val="0"/>
+                <w:sz w:val="21"/>
+                <w:rFonts w:eastAsia="宋体" w:ascii="Times New Roman" w:hAnsi="Times New Roman"/>
+              </w:rPr>
+              <w:t>337</w:t>
+            </w:r>
+          </w:p>
+        </w:tc>
+        <w:tc>
+          <w:tcPr>
+            <w:tcW w:type="dxa" w:w="794"/>
+            <w:vAlign w:val="center"/>
+          </w:tcPr>
+          <w:p>
+            <w:pPr>
+              <w:jc w:val="center"/>
+            </w:pPr>
+            <w:r/>
+            <w:r>
+              <w:rPr>
+                <w:b w:val="0"/>
+                <w:sz w:val="21"/>
+                <w:rFonts w:eastAsia="宋体" w:ascii="Times New Roman" w:hAnsi="Times New Roman"/>
+              </w:rPr>
+              <w:t>0</w:t>
             </w:r>
           </w:p>
         </w:tc>
@@ -4827,6 +7017,59 @@
     </w:p>
     <w:p>
       <w:pPr>
+        <w:jc w:val="center"/>
+      </w:pPr>
+      <w:r>
+        <w:drawing>
+          <wp:inline xmlns:a="http://schemas.openxmlformats.org/drawingml/2006/main" xmlns:pic="http://schemas.openxmlformats.org/drawingml/2006/picture">
+            <wp:extent cx="5580000" cy="3145091"/>
+            <wp:docPr id="4" name="Picture 4"/>
+            <wp:cNvGraphicFramePr>
+              <a:graphicFrameLocks noChangeAspect="1"/>
+            </wp:cNvGraphicFramePr>
+            <a:graphic>
+              <a:graphicData uri="http://schemas.openxmlformats.org/drawingml/2006/picture">
+                <pic:pic>
+                  <pic:nvPicPr>
+                    <pic:cNvPr id="0" name="congestion_cells.png"/>
+                    <pic:cNvPicPr/>
+                  </pic:nvPicPr>
+                  <pic:blipFill>
+                    <a:blip r:embed="rId12"/>
+                    <a:stretch>
+                      <a:fillRect/>
+                    </a:stretch>
+                  </pic:blipFill>
+                  <pic:spPr>
+                    <a:xfrm>
+                      <a:off x="0" y="0"/>
+                      <a:ext cx="5580000" cy="3145091"/>
+                    </a:xfrm>
+                    <a:prstGeom prst="rect"/>
+                  </pic:spPr>
+                </pic:pic>
+              </a:graphicData>
+            </a:graphic>
+          </wp:inline>
+        </w:drawing>
+      </w:r>
+    </w:p>
+    <w:p>
+      <w:pPr>
+        <w:spacing w:line="324" w:lineRule="auto" w:after="120"/>
+        <w:jc w:val="center"/>
+      </w:pPr>
+      <w:r>
+        <w:rPr>
+          <w:b w:val="0"/>
+          <w:sz w:val="24"/>
+          <w:rFonts w:eastAsia="宋体" w:ascii="Times New Roman" w:hAnsi="Times New Roman"/>
+        </w:rPr>
+        <w:t>图6-3 拥挤网格数量对比</w:t>
+      </w:r>
+    </w:p>
+    <w:p>
+      <w:pPr>
         <w:pStyle w:val="Heading2"/>
         <w:spacing w:before="160" w:after="120"/>
         <w:jc w:val="left"/>
@@ -4852,7 +7095,7 @@
           <w:sz w:val="24"/>
           <w:rFonts w:eastAsia="宋体" w:ascii="Times New Roman" w:hAnsi="Times New Roman"/>
         </w:rPr>
-        <w:t>从布通率看，PSO-Hanan优化算法在五组案例中均达到100%，满足开题阶段提出的布通率不低于98%的目标。基线规则方案在无障碍的前三个案例中也能完成布线，但在含障碍和面积受限案例中出现未布点或未布通问题，平均布通率为94.68%。这说明简单行列式规则对空间条件比较敏感，一旦障碍破坏规则排布或尾板高度不足，就可能无法为部分金手指找到合法测试点。优化方案通过候选过滤、PSO参数搜索和局部搜索，在障碍附近自动调整测试点位置，因此保持了完整覆盖。</w:t>
+        <w:t>从布通率看，最终拥塞感知算法在五组案例中均达到100%，满足开题阶段提出的布通率不低于98%的目标。基线规则方案在无障碍的前三个案例中也能完成布线，但在含障碍和面积受限案例中出现未布点或未布通问题，平均布通率为94.68%。这说明简单行列式规则对空间条件比较敏感，一旦障碍破坏规则排布或尾板高度不足，就可能无法为部分金手指找到合法测试点。优化方案通过候选过滤、PSO参数搜索和局部搜索，在障碍附近自动调整测试点位置，因此保持了完整覆盖。</w:t>
       </w:r>
     </w:p>
     <w:p>
@@ -4866,7 +7109,7 @@
           <w:sz w:val="24"/>
           <w:rFonts w:eastAsia="宋体" w:ascii="Times New Roman" w:hAnsi="Times New Roman"/>
         </w:rPr>
-        <w:t>从面积占比看，PSO-Hanan算法的平均面积占比为14.57%，明显低于基线方案的59.19%。这是因为基线方案为了满足点间距，通常沿尾板纵向均匀铺开测试点，导致测试点包围盒高度较大；优化方案根据金手指分布进行分组，并通过粒子群搜索布点参数，在保证间距的前提下压缩布点区域。对于高密度和面积受限案例，面积压缩效果尤为明显，说明协同优化对尾板尺寸控制具有实际意义。</w:t>
+        <w:t>从面积占比看，最终算法的平均面积占比为14.57%，明显低于基线方案的59.19%。这是因为基线方案为了满足点间距，通常沿尾板纵向均匀铺开测试点，导致测试点包围盒高度较大；优化方案根据金手指分布进行分组，并通过粒子群搜索布点参数，在保证间距的前提下压缩布点区域。对于高密度和面积受限案例，面积压缩效果尤为明显，说明协同优化对尾板尺寸控制具有实际意义。</w:t>
       </w:r>
     </w:p>
     <w:p>
@@ -4880,7 +7123,21 @@
           <w:sz w:val="24"/>
           <w:rFonts w:eastAsia="宋体" w:ascii="Times New Roman" w:hAnsi="Times New Roman"/>
         </w:rPr>
-        <w:t>从总线长看，PSO-Hanan方案平均总线长为796.60 mm，低于基线方案的2014.40 mm。线长降低主要来自两个方面：一是测试点整体更靠近金手指边缘，减少了纵向引出距离；二是PSO搜索避免了部分测试点被放置到远离其端子的行列位置。较短线长不仅有助于节省布线资源，也有利于降低寄生效应和信号完整性风险。虽然本文原型没有进行阻抗连续性和差分对等长等高级电气约束处理，但路径长度指标已经能够反映基本布线经济性。</w:t>
+        <w:t>从总线长看，最终方案平均总线长为838.60 mm，仍显著低于基线方案的2014.40 mm；纯PSO-Hanan方案平均线长为796.60 mm，略低于拥塞重布线方案。该差异说明拥塞感知重布线并非单纯追求最短路径，而是在较短线长基础上为热点区域留出绕行空间。较短线长有助于节省布线资源，而适度绕行有助于缓解通道集中和后续层分配压力，两者共同构成更接近工程实际的布线质量评价。</w:t>
+      </w:r>
+    </w:p>
+    <w:p>
+      <w:pPr>
+        <w:spacing w:line="324" w:lineRule="auto" w:after="120"/>
+        <w:ind w:firstLine="420"/>
+      </w:pPr>
+      <w:r>
+        <w:rPr>
+          <w:b w:val="0"/>
+          <w:sz w:val="24"/>
+          <w:rFonts w:eastAsia="宋体" w:ascii="Times New Roman" w:hAnsi="Times New Roman"/>
+        </w:rPr>
+        <w:t>从拥塞指标看，PSO-Hanan方案的平均拥塞峰值为3.00，平均拥挤网格数为240.00；拥塞重布线方案的平均拥塞峰值为2.80，平均拥挤网格数为238.00。在中密度和面积受限案例中，动态拥塞代价有效降低了局部峰值或拥挤范围；在高密度案例中，由于测试点区域被强烈压缩，可用通道有限，重布线会出现线长增加和拥挤网格波动。该结果与网络流和蚁群布线研究中的结论一致：拥塞优化通常需要在路径长度、局部容量和布线顺序之间折中。</w:t>
       </w:r>
     </w:p>
     <w:p>
@@ -5042,7 +7299,7 @@
           <w:sz w:val="24"/>
           <w:rFonts w:eastAsia="宋体" w:ascii="Times New Roman" w:hAnsi="Times New Roman"/>
         </w:rPr>
-        <w:t>本文仍存在一些不足。首先，实验案例由参数化方式构造，尚未接入真实EDA文件格式，后续可支持Gerber、ODB++或IPC-2581等数据解析，提高与工程流程的结合程度。其次，当前布线模型采用两层合法化假设，未显式优化过孔数量、层分配和差分信号等长约束，后续可引入多层资源模型和线性规划合法化模块。再次，布点优化采用轻量禁忌搜索，适合中小规模案例，但面对更大规模板卡时，可进一步研究遗传算法、蚁群算法、网络流或强化学习策略。最后，原型当前以命令行和SVG展示为主，后续可开发Qt或Web可视化界面，实现交互式参数调整、动态布线展示和设计规则检查报告导出。</w:t>
+        <w:t>本文仍存在一些不足。首先，实验案例由参数化方式构造，尚未接入真实EDA文件格式，后续可支持Gerber、ODB++或IPC-2581等数据解析，提高与工程流程的结合程度。其次，当前布线模型采用两层合法化假设，未显式优化过孔数量、层分配和差分信号等长约束，后续可引入多层资源模型和线性规划合法化模块。再次，当前拥塞重布线属于轻量启发式方法，只统计网格占用并提高热点代价，尚未形成完整的网络流容量约束；后续可参考基于网络流的空间划分和流分配方法，将尾板通道容量、过孔资源和线序约束统一建模。最后，若能够获得真实PCB人工布线数据，可进一步参考领域模型和Transformer-A*联合布线方法，让模型学习人工布线范式，并将预测结果作为A*或拥塞重布线的先验。</w:t>
       </w:r>
     </w:p>
     <w:p>
@@ -5292,7 +7549,7 @@
           <w:sz w:val="24"/>
           <w:rFonts w:eastAsia="宋体" w:ascii="Times New Roman" w:hAnsi="Times New Roman"/>
         </w:rPr>
-        <w:t>[18] 郑杰. 基于PCB布线领域模型的电子线路自动布线方法的设计[D]. 2022.</w:t>
+        <w:t>[18] 刘自铭. 基于蚁群算法的多层印刷电路板布线研究[D]. 2023.</w:t>
       </w:r>
     </w:p>
     <w:p>
@@ -5305,7 +7562,7 @@
           <w:sz w:val="24"/>
           <w:rFonts w:eastAsia="宋体" w:ascii="Times New Roman" w:hAnsi="Times New Roman"/>
         </w:rPr>
-        <w:t>[19] 白胜泷. 基于Transformer的PCB自动布线算法[D]. 2024.</w:t>
+        <w:t>[19] 郑杰. 基于PCB布线领域模型的电子线路自动布线方法的设计[D]. 2022.</w:t>
       </w:r>
     </w:p>
     <w:p>
@@ -5318,7 +7575,7 @@
           <w:sz w:val="24"/>
           <w:rFonts w:eastAsia="宋体" w:ascii="Times New Roman" w:hAnsi="Times New Roman"/>
         </w:rPr>
-        <w:t>[20] PCBCart. Gold finger PCB manufacturer: hard gold edge connector PCBs[EB/OL]. https://www.pcbcart.com/article/content/gold-finger-pcb.html.</w:t>
+        <w:t>[20] 白胜泷. 基于Transformer的PCB自动布线算法[D]. 2024.</w:t>
       </w:r>
     </w:p>
     <w:p>
@@ -5331,7 +7588,7 @@
           <w:sz w:val="24"/>
           <w:rFonts w:eastAsia="宋体" w:ascii="Times New Roman" w:hAnsi="Times New Roman"/>
         </w:rPr>
-        <w:t>[21] WellPCB. The complete guide to gold finger PCB manufacturing[EB/OL]. https://www.wellpcb.com/gold-finger-pcb.html.</w:t>
+        <w:t>[21] PCBCart. Gold finger PCB manufacturer: hard gold edge connector PCBs[EB/OL]. https://www.pcbcart.com/article/content/gold-finger-pcb.html.</w:t>
       </w:r>
     </w:p>
     <w:p>
@@ -5344,7 +7601,20 @@
           <w:sz w:val="24"/>
           <w:rFonts w:eastAsia="宋体" w:ascii="Times New Roman" w:hAnsi="Times New Roman"/>
         </w:rPr>
-        <w:t>[22] NexPCB. Design for testability: how to create easily testable PCBs[EB/OL]. https://www.nexpcb.com/blog/design-for-testability-dft.</w:t>
+        <w:t>[22] WellPCB. The complete guide to gold finger PCB manufacturing[EB/OL]. https://www.wellpcb.com/gold-finger-pcb.html.</w:t>
+      </w:r>
+    </w:p>
+    <w:p>
+      <w:pPr>
+        <w:spacing w:line="324" w:lineRule="auto" w:after="120"/>
+      </w:pPr>
+      <w:r>
+        <w:rPr>
+          <w:b w:val="0"/>
+          <w:sz w:val="24"/>
+          <w:rFonts w:eastAsia="宋体" w:ascii="Times New Roman" w:hAnsi="Times New Roman"/>
+        </w:rPr>
+        <w:t>[23] NexPCB. Design for testability: how to create easily testable PCBs[EB/OL]. https://www.nexpcb.com/blog/design-for-testability-dft.</w:t>
       </w:r>
     </w:p>
     <w:p>

</xml_diff>

<commit_message>
Align thesis with task requirements
</commit_message>
<xml_diff>
--- a/paper/面向PCB金手指的测试尾板布点布线设计_完成稿.docx
+++ b/paper/面向PCB金手指的测试尾板布点布线设计_完成稿.docx
@@ -46,6 +46,7 @@
       <w:tr>
         <w:trPr>
           <w:trHeight w:val="510"/>
+          <w:tblHeader w:val="true"/>
         </w:trPr>
         <w:tc>
           <w:tcPr>
@@ -622,9 +623,635 @@
           <w:sz w:val="24"/>
           <w:rFonts w:eastAsia="宋体" w:ascii="Times New Roman" w:hAnsi="Times New Roman"/>
         </w:rPr>
-        <w:t>本文围绕面向PCB金手指的测试尾板自动化设计展开，主要完成以下工作：一是梳理金手指测试尾板的结构、工艺和测试需求，建立布点布线设计规则库；二是提出测试点候选生成、初始布点、局部优化和布线合法化的一体化流程；三是基于C++17实现命令行算法原型，形成可复现实验数据和可视化结果；四是构造五类典型案例，与规则基线方案进行对比，分析算法在覆盖率、布通率、面积占比、线长和违规数方面的效果。论文第二章介绍理论基础和约束建模，第三章给出布点算法，第四章给出布线与协同优化方法，第五章介绍系统实现，第六章分析实验结果，第七章总结全文并展望后续工作。</w:t>
+        <w:t>本文围绕面向PCB金手指的测试尾板自动化设计展开，研究内容与毕业设计任务书的六项要求保持一致：完成文献调研和开题基础工作，建立金手指测试尾板案例与约束模型，设计布点布线算法，完成C++核心代码实现，开展人工/规则基线与优化算法的量化对比，并在实验数据基础上完成毕业论文撰写。具体而言，本文首先梳理金手指测试尾板的结构、工艺和测试需求，建立布点布线设计规则库；随后提出测试点候选生成、初始布点、局部优化、A*布线和拥塞重布线的一体化流程；再基于C++17实现命令行算法原型，形成可复现实验数据和可视化结果；最后构造五类典型案例，与规则基线方案进行对比，分析算法在覆盖率、布通率、面积占比、线长、拥塞和违规数方面的效果。论文第二章介绍理论基础和约束建模，第三章给出布点算法，第四章给出布线与协同优化方法，第五章介绍系统实现，第六章分析实验结果，第七章总结全文并展望后续工作。</w:t>
       </w:r>
     </w:p>
+    <w:p>
+      <w:pPr>
+        <w:pStyle w:val="Heading2"/>
+        <w:spacing w:before="160" w:after="120"/>
+        <w:jc w:val="left"/>
+      </w:pPr>
+      <w:r>
+        <w:rPr>
+          <w:b/>
+          <w:color w:val="1F4E79"/>
+          <w:sz w:val="28"/>
+          <w:rFonts w:eastAsia="黑体" w:ascii="Arial" w:hAnsi="Arial"/>
+        </w:rPr>
+        <w:t>1.4 任务书要求与完成情况</w:t>
+      </w:r>
+    </w:p>
+    <w:p>
+      <w:pPr>
+        <w:spacing w:line="324" w:lineRule="auto" w:after="120"/>
+        <w:ind w:firstLine="420"/>
+      </w:pPr>
+      <w:r>
+        <w:rPr>
+          <w:b w:val="0"/>
+          <w:sz w:val="24"/>
+          <w:rFonts w:eastAsia="宋体" w:ascii="Times New Roman" w:hAnsi="Times New Roman"/>
+        </w:rPr>
+        <w:t>为保证论文内容能够直接对应毕业设计主要任务和验收要求，本文将任务书要求归纳为六项，并在论文、代码和实验结果中逐项落实。需要说明的是，当前未获得企业原始PCB设计文件，因此第二项中的案例获取采用“真实应用场景参数化构造”的方式完成，即依据金手指数量、板边间距、测试点间距、尾板尺寸和障碍区等工程约束构造案例化仿真数据，论文中不声称实验数据来自企业量产板卡。</w:t>
+      </w:r>
+    </w:p>
+    <w:tbl>
+      <w:tblPr>
+        <w:tblStyle w:val="TableGrid"/>
+        <w:tblW w:type="auto" w:w="0"/>
+        <w:jc w:val="center"/>
+        <w:tblLook w:firstColumn="1" w:firstRow="1" w:lastColumn="0" w:lastRow="0" w:noHBand="0" w:noVBand="1" w:val="04A0"/>
+      </w:tblPr>
+      <w:tblGrid>
+        <w:gridCol w:w="2268"/>
+        <w:gridCol w:w="2268"/>
+        <w:gridCol w:w="2268"/>
+        <w:gridCol w:w="2268"/>
+      </w:tblGrid>
+      <w:tr>
+        <w:trPr>
+          <w:tblHeader w:val="true"/>
+        </w:trPr>
+        <w:tc>
+          <w:tcPr>
+            <w:tcW w:type="dxa" w:w="680"/>
+            <w:vAlign w:val="center"/>
+            <w:shd w:fill="EAF2F8"/>
+          </w:tcPr>
+          <w:p>
+            <w:pPr>
+              <w:jc w:val="center"/>
+            </w:pPr>
+            <w:r/>
+            <w:r>
+              <w:rPr>
+                <w:b/>
+                <w:sz w:val="21"/>
+                <w:rFonts w:eastAsia="宋体" w:ascii="Times New Roman" w:hAnsi="Times New Roman"/>
+              </w:rPr>
+              <w:t>序号</w:t>
+            </w:r>
+          </w:p>
+        </w:tc>
+        <w:tc>
+          <w:tcPr>
+            <w:tcW w:type="dxa" w:w="2381"/>
+            <w:vAlign w:val="center"/>
+            <w:shd w:fill="EAF2F8"/>
+          </w:tcPr>
+          <w:p>
+            <w:pPr>
+              <w:jc w:val="center"/>
+            </w:pPr>
+            <w:r/>
+            <w:r>
+              <w:rPr>
+                <w:b/>
+                <w:sz w:val="21"/>
+                <w:rFonts w:eastAsia="宋体" w:ascii="Times New Roman" w:hAnsi="Times New Roman"/>
+              </w:rPr>
+              <w:t>任务书主要要求</w:t>
+            </w:r>
+          </w:p>
+        </w:tc>
+        <w:tc>
+          <w:tcPr>
+            <w:tcW w:type="dxa" w:w="3402"/>
+            <w:vAlign w:val="center"/>
+            <w:shd w:fill="EAF2F8"/>
+          </w:tcPr>
+          <w:p>
+            <w:pPr>
+              <w:jc w:val="center"/>
+            </w:pPr>
+            <w:r/>
+            <w:r>
+              <w:rPr>
+                <w:b/>
+                <w:sz w:val="21"/>
+                <w:rFonts w:eastAsia="宋体" w:ascii="Times New Roman" w:hAnsi="Times New Roman"/>
+              </w:rPr>
+              <w:t>本文完成方式</w:t>
+            </w:r>
+          </w:p>
+        </w:tc>
+        <w:tc>
+          <w:tcPr>
+            <w:tcW w:type="dxa" w:w="2721"/>
+            <w:vAlign w:val="center"/>
+            <w:shd w:fill="EAF2F8"/>
+          </w:tcPr>
+          <w:p>
+            <w:pPr>
+              <w:jc w:val="center"/>
+            </w:pPr>
+            <w:r/>
+            <w:r>
+              <w:rPr>
+                <w:b/>
+                <w:sz w:val="21"/>
+                <w:rFonts w:eastAsia="宋体" w:ascii="Times New Roman" w:hAnsi="Times New Roman"/>
+              </w:rPr>
+              <w:t>对应成果</w:t>
+            </w:r>
+          </w:p>
+        </w:tc>
+      </w:tr>
+      <w:tr>
+        <w:tc>
+          <w:tcPr>
+            <w:tcW w:type="dxa" w:w="680"/>
+            <w:vAlign w:val="center"/>
+          </w:tcPr>
+          <w:p>
+            <w:pPr>
+              <w:jc w:val="center"/>
+            </w:pPr>
+            <w:r/>
+            <w:r>
+              <w:rPr>
+                <w:b w:val="0"/>
+                <w:sz w:val="21"/>
+                <w:rFonts w:eastAsia="宋体" w:ascii="Times New Roman" w:hAnsi="Times New Roman"/>
+              </w:rPr>
+              <w:t>1</w:t>
+            </w:r>
+          </w:p>
+        </w:tc>
+        <w:tc>
+          <w:tcPr>
+            <w:tcW w:type="dxa" w:w="2381"/>
+            <w:vAlign w:val="center"/>
+          </w:tcPr>
+          <w:p>
+            <w:pPr>
+              <w:jc w:val="left"/>
+            </w:pPr>
+            <w:r/>
+            <w:r>
+              <w:rPr>
+                <w:b w:val="0"/>
+                <w:sz w:val="21"/>
+                <w:rFonts w:eastAsia="宋体" w:ascii="Times New Roman" w:hAnsi="Times New Roman"/>
+              </w:rPr>
+              <w:t>查阅不少于15篇文献，其中近五年英文文献不少于3篇，完成开题基础工作</w:t>
+            </w:r>
+          </w:p>
+        </w:tc>
+        <w:tc>
+          <w:tcPr>
+            <w:tcW w:type="dxa" w:w="3402"/>
+            <w:vAlign w:val="center"/>
+          </w:tcPr>
+          <w:p>
+            <w:pPr>
+              <w:jc w:val="left"/>
+            </w:pPr>
+            <w:r/>
+            <w:r>
+              <w:rPr>
+                <w:b w:val="0"/>
+                <w:sz w:val="21"/>
+                <w:rFonts w:eastAsia="宋体" w:ascii="Times New Roman" w:hAnsi="Times New Roman"/>
+              </w:rPr>
+              <w:t>围绕DFT测试点插入、PCB自动布线、网络流、蚁群算法、领域模型和Transformer-A*布线整理国内外研究现状</w:t>
+            </w:r>
+          </w:p>
+        </w:tc>
+        <w:tc>
+          <w:tcPr>
+            <w:tcW w:type="dxa" w:w="2721"/>
+            <w:vAlign w:val="center"/>
+          </w:tcPr>
+          <w:p>
+            <w:pPr>
+              <w:jc w:val="left"/>
+            </w:pPr>
+            <w:r/>
+            <w:r>
+              <w:rPr>
+                <w:b w:val="0"/>
+                <w:sz w:val="21"/>
+                <w:rFonts w:eastAsia="宋体" w:ascii="Times New Roman" w:hAnsi="Times New Roman"/>
+              </w:rPr>
+              <w:t>参考文献23篇；近五年英文文献包括DeepTPI、NS-Place、Legalized Routing、Integration综述等</w:t>
+            </w:r>
+          </w:p>
+        </w:tc>
+      </w:tr>
+      <w:tr>
+        <w:tc>
+          <w:tcPr>
+            <w:tcW w:type="dxa" w:w="680"/>
+            <w:vAlign w:val="center"/>
+          </w:tcPr>
+          <w:p>
+            <w:pPr>
+              <w:jc w:val="center"/>
+            </w:pPr>
+            <w:r/>
+            <w:r>
+              <w:rPr>
+                <w:b w:val="0"/>
+                <w:sz w:val="21"/>
+                <w:rFonts w:eastAsia="宋体" w:ascii="Times New Roman" w:hAnsi="Times New Roman"/>
+              </w:rPr>
+              <w:t>2</w:t>
+            </w:r>
+          </w:p>
+        </w:tc>
+        <w:tc>
+          <w:tcPr>
+            <w:tcW w:type="dxa" w:w="2381"/>
+            <w:vAlign w:val="center"/>
+          </w:tcPr>
+          <w:p>
+            <w:pPr>
+              <w:jc w:val="left"/>
+            </w:pPr>
+            <w:r/>
+            <w:r>
+              <w:rPr>
+                <w:b w:val="0"/>
+                <w:sz w:val="21"/>
+                <w:rFonts w:eastAsia="宋体" w:ascii="Times New Roman" w:hAnsi="Times New Roman"/>
+              </w:rPr>
+              <w:t>获取真实应用场景下PCB金手指测试尾板设计案例，并确定布点布线约束</w:t>
+            </w:r>
+          </w:p>
+        </w:tc>
+        <w:tc>
+          <w:tcPr>
+            <w:tcW w:type="dxa" w:w="3402"/>
+            <w:vAlign w:val="center"/>
+          </w:tcPr>
+          <w:p>
+            <w:pPr>
+              <w:jc w:val="left"/>
+            </w:pPr>
+            <w:r/>
+            <w:r>
+              <w:rPr>
+                <w:b w:val="0"/>
+                <w:sz w:val="21"/>
+                <w:rFonts w:eastAsia="宋体" w:ascii="Times New Roman" w:hAnsi="Times New Roman"/>
+              </w:rPr>
+              <w:t>在无企业原始文件条件下，构造40 pin、80 pin、120 pin、含障碍96 pin和面积受限100 pin五类案例，并给出尾板尺寸、间距、障碍和网格规则</w:t>
+            </w:r>
+          </w:p>
+        </w:tc>
+        <w:tc>
+          <w:tcPr>
+            <w:tcW w:type="dxa" w:w="2721"/>
+            <w:vAlign w:val="center"/>
+          </w:tcPr>
+          <w:p>
+            <w:pPr>
+              <w:jc w:val="left"/>
+            </w:pPr>
+            <w:r/>
+            <w:r>
+              <w:rPr>
+                <w:b w:val="0"/>
+                <w:sz w:val="21"/>
+                <w:rFonts w:eastAsia="宋体" w:ascii="Times New Roman" w:hAnsi="Times New Roman"/>
+              </w:rPr>
+              <w:t>data/case_01.csv至case_05.csv；第2章约束表；第6章案例表</w:t>
+            </w:r>
+          </w:p>
+        </w:tc>
+      </w:tr>
+      <w:tr>
+        <w:tc>
+          <w:tcPr>
+            <w:tcW w:type="dxa" w:w="680"/>
+            <w:vAlign w:val="center"/>
+          </w:tcPr>
+          <w:p>
+            <w:pPr>
+              <w:jc w:val="center"/>
+            </w:pPr>
+            <w:r/>
+            <w:r>
+              <w:rPr>
+                <w:b w:val="0"/>
+                <w:sz w:val="21"/>
+                <w:rFonts w:eastAsia="宋体" w:ascii="Times New Roman" w:hAnsi="Times New Roman"/>
+              </w:rPr>
+              <w:t>3</w:t>
+            </w:r>
+          </w:p>
+        </w:tc>
+        <w:tc>
+          <w:tcPr>
+            <w:tcW w:type="dxa" w:w="2381"/>
+            <w:vAlign w:val="center"/>
+          </w:tcPr>
+          <w:p>
+            <w:pPr>
+              <w:jc w:val="left"/>
+            </w:pPr>
+            <w:r/>
+            <w:r>
+              <w:rPr>
+                <w:b w:val="0"/>
+                <w:sz w:val="21"/>
+                <w:rFonts w:eastAsia="宋体" w:ascii="Times New Roman" w:hAnsi="Times New Roman"/>
+              </w:rPr>
+              <w:t>设计面向PCB金手指测试尾板的布点布线算法，给出算法框架和设计过程</w:t>
+            </w:r>
+          </w:p>
+        </w:tc>
+        <w:tc>
+          <w:tcPr>
+            <w:tcW w:type="dxa" w:w="3402"/>
+            <w:vAlign w:val="center"/>
+          </w:tcPr>
+          <w:p>
+            <w:pPr>
+              <w:jc w:val="left"/>
+            </w:pPr>
+            <w:r/>
+            <w:r>
+              <w:rPr>
+                <w:b w:val="0"/>
+                <w:sz w:val="21"/>
+                <w:rFonts w:eastAsia="宋体" w:ascii="Times New Roman" w:hAnsi="Times New Roman"/>
+              </w:rPr>
+              <w:t>形成规则网格候选生成、K-means初始分组、禁忌搜索、PSO-Hanan布点、A*布线和拥塞感知拆线重布流程</w:t>
+            </w:r>
+          </w:p>
+        </w:tc>
+        <w:tc>
+          <w:tcPr>
+            <w:tcW w:type="dxa" w:w="2721"/>
+            <w:vAlign w:val="center"/>
+          </w:tcPr>
+          <w:p>
+            <w:pPr>
+              <w:jc w:val="left"/>
+            </w:pPr>
+            <w:r/>
+            <w:r>
+              <w:rPr>
+                <w:b w:val="0"/>
+                <w:sz w:val="21"/>
+                <w:rFonts w:eastAsia="宋体" w:ascii="Times New Roman" w:hAnsi="Times New Roman"/>
+              </w:rPr>
+              <w:t>第3章布点算法；第4章布线算法；图3-1流程图</w:t>
+            </w:r>
+          </w:p>
+        </w:tc>
+      </w:tr>
+      <w:tr>
+        <w:tc>
+          <w:tcPr>
+            <w:tcW w:type="dxa" w:w="680"/>
+            <w:vAlign w:val="center"/>
+          </w:tcPr>
+          <w:p>
+            <w:pPr>
+              <w:jc w:val="center"/>
+            </w:pPr>
+            <w:r/>
+            <w:r>
+              <w:rPr>
+                <w:b w:val="0"/>
+                <w:sz w:val="21"/>
+                <w:rFonts w:eastAsia="宋体" w:ascii="Times New Roman" w:hAnsi="Times New Roman"/>
+              </w:rPr>
+              <w:t>4</w:t>
+            </w:r>
+          </w:p>
+        </w:tc>
+        <w:tc>
+          <w:tcPr>
+            <w:tcW w:type="dxa" w:w="2381"/>
+            <w:vAlign w:val="center"/>
+          </w:tcPr>
+          <w:p>
+            <w:pPr>
+              <w:jc w:val="left"/>
+            </w:pPr>
+            <w:r/>
+            <w:r>
+              <w:rPr>
+                <w:b w:val="0"/>
+                <w:sz w:val="21"/>
+                <w:rFonts w:eastAsia="宋体" w:ascii="Times New Roman" w:hAnsi="Times New Roman"/>
+              </w:rPr>
+              <w:t>基于C++实现算法核心代码，确保代码可运行且注释清晰</w:t>
+            </w:r>
+          </w:p>
+        </w:tc>
+        <w:tc>
+          <w:tcPr>
+            <w:tcW w:type="dxa" w:w="3402"/>
+            <w:vAlign w:val="center"/>
+          </w:tcPr>
+          <w:p>
+            <w:pPr>
+              <w:jc w:val="left"/>
+            </w:pPr>
+            <w:r/>
+            <w:r>
+              <w:rPr>
+                <w:b w:val="0"/>
+                <w:sz w:val="21"/>
+                <w:rFonts w:eastAsia="宋体" w:ascii="Times New Roman" w:hAnsi="Times New Roman"/>
+              </w:rPr>
+              <w:t>采用C++17命令行原型实现案例解析、布点、布线、指标统计和SVG输出，同时提供CMakeLists.txt与Makefile</w:t>
+            </w:r>
+          </w:p>
+        </w:tc>
+        <w:tc>
+          <w:tcPr>
+            <w:tcW w:type="dxa" w:w="2721"/>
+            <w:vAlign w:val="center"/>
+          </w:tcPr>
+          <w:p>
+            <w:pPr>
+              <w:jc w:val="left"/>
+            </w:pPr>
+            <w:r/>
+            <w:r>
+              <w:rPr>
+                <w:b w:val="0"/>
+                <w:sz w:val="21"/>
+                <w:rFonts w:eastAsia="宋体" w:ascii="Times New Roman" w:hAnsi="Times New Roman"/>
+              </w:rPr>
+              <w:t>include/pcb_tail_router.hpp；src/main.cpp；README.md；make run-all验证</w:t>
+            </w:r>
+          </w:p>
+        </w:tc>
+      </w:tr>
+      <w:tr>
+        <w:tc>
+          <w:tcPr>
+            <w:tcW w:type="dxa" w:w="680"/>
+            <w:vAlign w:val="center"/>
+          </w:tcPr>
+          <w:p>
+            <w:pPr>
+              <w:jc w:val="center"/>
+            </w:pPr>
+            <w:r/>
+            <w:r>
+              <w:rPr>
+                <w:b w:val="0"/>
+                <w:sz w:val="21"/>
+                <w:rFonts w:eastAsia="宋体" w:ascii="Times New Roman" w:hAnsi="Times New Roman"/>
+              </w:rPr>
+              <w:t>5</w:t>
+            </w:r>
+          </w:p>
+        </w:tc>
+        <w:tc>
+          <w:tcPr>
+            <w:tcW w:type="dxa" w:w="2381"/>
+            <w:vAlign w:val="center"/>
+          </w:tcPr>
+          <w:p>
+            <w:pPr>
+              <w:jc w:val="left"/>
+            </w:pPr>
+            <w:r/>
+            <w:r>
+              <w:rPr>
+                <w:b w:val="0"/>
+                <w:sz w:val="21"/>
+                <w:rFonts w:eastAsia="宋体" w:ascii="Times New Roman" w:hAnsi="Times New Roman"/>
+              </w:rPr>
+              <w:t>开展对比实验，与人工布点布线在面积、布通率、合法性等指标上量化对比</w:t>
+            </w:r>
+          </w:p>
+        </w:tc>
+        <w:tc>
+          <w:tcPr>
+            <w:tcW w:type="dxa" w:w="3402"/>
+            <w:vAlign w:val="center"/>
+          </w:tcPr>
+          <w:p>
+            <w:pPr>
+              <w:jc w:val="left"/>
+            </w:pPr>
+            <w:r/>
+            <w:r>
+              <w:rPr>
+                <w:b w:val="0"/>
+                <w:sz w:val="21"/>
+                <w:rFonts w:eastAsia="宋体" w:ascii="Times New Roman" w:hAnsi="Times New Roman"/>
+              </w:rPr>
+              <w:t>以规则行列式方案近似人工经验基线，并与K-means、PSO-Hanan、拥塞重布线三类优化方案对比</w:t>
+            </w:r>
+          </w:p>
+        </w:tc>
+        <w:tc>
+          <w:tcPr>
+            <w:tcW w:type="dxa" w:w="2721"/>
+            <w:vAlign w:val="center"/>
+          </w:tcPr>
+          <w:p>
+            <w:pPr>
+              <w:jc w:val="left"/>
+            </w:pPr>
+            <w:r/>
+            <w:r>
+              <w:rPr>
+                <w:b w:val="0"/>
+                <w:sz w:val="21"/>
+                <w:rFonts w:eastAsia="宋体" w:ascii="Times New Roman" w:hAnsi="Times New Roman"/>
+              </w:rPr>
+              <w:t>results/case_*/metrics.csv；第6章指标表和三张对比图</w:t>
+            </w:r>
+          </w:p>
+        </w:tc>
+      </w:tr>
+      <w:tr>
+        <w:tc>
+          <w:tcPr>
+            <w:tcW w:type="dxa" w:w="680"/>
+            <w:vAlign w:val="center"/>
+          </w:tcPr>
+          <w:p>
+            <w:pPr>
+              <w:jc w:val="center"/>
+            </w:pPr>
+            <w:r/>
+            <w:r>
+              <w:rPr>
+                <w:b w:val="0"/>
+                <w:sz w:val="21"/>
+                <w:rFonts w:eastAsia="宋体" w:ascii="Times New Roman" w:hAnsi="Times New Roman"/>
+              </w:rPr>
+              <w:t>6</w:t>
+            </w:r>
+          </w:p>
+        </w:tc>
+        <w:tc>
+          <w:tcPr>
+            <w:tcW w:type="dxa" w:w="2381"/>
+            <w:vAlign w:val="center"/>
+          </w:tcPr>
+          <w:p>
+            <w:pPr>
+              <w:jc w:val="left"/>
+            </w:pPr>
+            <w:r/>
+            <w:r>
+              <w:rPr>
+                <w:b w:val="0"/>
+                <w:sz w:val="21"/>
+                <w:rFonts w:eastAsia="宋体" w:ascii="Times New Roman" w:hAnsi="Times New Roman"/>
+              </w:rPr>
+              <w:t>分析实验数据并完成不少于1.2万字毕业论文</w:t>
+            </w:r>
+          </w:p>
+        </w:tc>
+        <w:tc>
+          <w:tcPr>
+            <w:tcW w:type="dxa" w:w="3402"/>
+            <w:vAlign w:val="center"/>
+          </w:tcPr>
+          <w:p>
+            <w:pPr>
+              <w:jc w:val="left"/>
+            </w:pPr>
+            <w:r/>
+            <w:r>
+              <w:rPr>
+                <w:b w:val="0"/>
+                <w:sz w:val="21"/>
+                <w:rFonts w:eastAsia="宋体" w:ascii="Times New Roman" w:hAnsi="Times New Roman"/>
+              </w:rPr>
+              <w:t>根据最新程序输出重建论文数据表、图表和结论，围绕布通率、面积、线长、拥塞和违规数进行分析</w:t>
+            </w:r>
+          </w:p>
+        </w:tc>
+        <w:tc>
+          <w:tcPr>
+            <w:tcW w:type="dxa" w:w="2721"/>
+            <w:vAlign w:val="center"/>
+          </w:tcPr>
+          <w:p>
+            <w:pPr>
+              <w:jc w:val="left"/>
+            </w:pPr>
+            <w:r/>
+            <w:r>
+              <w:rPr>
+                <w:b w:val="0"/>
+                <w:sz w:val="21"/>
+                <w:rFonts w:eastAsia="宋体" w:ascii="Times New Roman" w:hAnsi="Times New Roman"/>
+              </w:rPr>
+              <w:t>完成稿正文超过1.2万字；参考文献格式统一；DOCX渲染检查通过</w:t>
+            </w:r>
+          </w:p>
+        </w:tc>
+      </w:tr>
+    </w:tbl>
+    <w:p/>
     <w:p>
       <w:pPr>
         <w:pStyle w:val="Heading1"/>
@@ -699,6 +1326,9 @@
         <w:gridCol w:w="2268"/>
       </w:tblGrid>
       <w:tr>
+        <w:trPr>
+          <w:tblHeader w:val="true"/>
+        </w:trPr>
         <w:tc>
           <w:tcPr>
             <w:tcW w:type="dxa" w:w="1474"/>
@@ -1561,6 +2191,9 @@
         <w:gridCol w:w="2268"/>
       </w:tblGrid>
       <w:tr>
+        <w:trPr>
+          <w:tblHeader w:val="true"/>
+        </w:trPr>
         <w:tc>
           <w:tcPr>
             <w:tcW w:type="dxa" w:w="1531"/>
@@ -2199,6 +2832,9 @@
         <w:gridCol w:w="3024"/>
       </w:tblGrid>
       <w:tr>
+        <w:trPr>
+          <w:tblHeader w:val="true"/>
+        </w:trPr>
         <w:tc>
           <w:tcPr>
             <w:tcW w:type="dxa" w:w="2608"/>
@@ -2725,6 +3361,9 @@
         <w:gridCol w:w="1512"/>
       </w:tblGrid>
       <w:tr>
+        <w:trPr>
+          <w:tblHeader w:val="true"/>
+        </w:trPr>
         <w:tc>
           <w:tcPr>
             <w:tcW w:type="dxa" w:w="1474"/>
@@ -3498,6 +4137,9 @@
         <w:gridCol w:w="1134"/>
       </w:tblGrid>
       <w:tr>
+        <w:trPr>
+          <w:tblHeader w:val="true"/>
+        </w:trPr>
         <w:tc>
           <w:tcPr>
             <w:tcW w:type="dxa" w:w="1134"/>
@@ -7274,6 +7916,20 @@
     </w:p>
     <w:p>
       <w:pPr>
+        <w:spacing w:line="324" w:lineRule="auto" w:after="120"/>
+        <w:ind w:firstLine="420"/>
+      </w:pPr>
+      <w:r>
+        <w:rPr>
+          <w:b w:val="0"/>
+          <w:sz w:val="24"/>
+          <w:rFonts w:eastAsia="宋体" w:ascii="Times New Roman" w:hAnsi="Times New Roman"/>
+        </w:rPr>
+        <w:t>对照任务书六项主要要求，本文完成情况如下：第一，完成了不少于15篇文献的调研，并补充近五年英文文献作为算法发展趋势依据；第二，在缺少企业原始PCB文件的条件下，构建了符合真实应用约束的五组金手指测试尾板案例，并明确测试点间距、障碍避让、网格步长和评价指标；第三，完成了布点布线算法框架设计，覆盖候选点生成、聚类分组、禁忌局部搜索、PSO-Hanan布点、A*搜索和拥塞重布线；第四，完成C++17核心代码实现，程序可通过Makefile或CMake构建并批量生成结果；第五，完成规则基线与三类优化方案的对比实验，并从布通率、面积、线长、拥塞和违规数进行量化分析；第六，基于最新实验数据完成论文正文、图表和参考文献整理，正文字数达到本科毕业论文要求。</w:t>
+      </w:r>
+    </w:p>
+    <w:p>
+      <w:pPr>
         <w:pStyle w:val="Heading2"/>
         <w:spacing w:before="160" w:after="120"/>
         <w:jc w:val="left"/>

</xml_diff>